<commit_message>
Update README.md to correct the logbook link and adjust the MoSCoW backlog percentage for MUSTS. Update LOGBOEK.docx to reflect recent changes.
</commit_message>
<xml_diff>
--- a/Docs/Opdracht-a/LOGBOEK.docx
+++ b/Docs/Opdracht-a/LOGBOEK.docx
@@ -72,25 +72,7 @@
         <w:t>Ontwikkelperiode:</w:t>
       </w:r>
       <w:r>
-        <w:t xml:space="preserve"> 30 augustus 2025 </w:t>
-      </w:r>
-      <w:r>
-        <w:t xml:space="preserve"> – </w:t>
-      </w:r>
-      <w:r>
-        <w:t xml:space="preserve"> </w:t>
-      </w:r>
-      <w:r>
-        <w:t>04</w:t>
-      </w:r>
-      <w:r>
-        <w:t xml:space="preserve"> </w:t>
-      </w:r>
-      <w:r>
-        <w:t>October</w:t>
-      </w:r>
-      <w:r>
-        <w:t xml:space="preserve"> 2025</w:t>
+        <w:t xml:space="preserve"> 30 augustus 2025  –  04 October 2025</w:t>
       </w:r>
       <w:r>
         <w:br/>
@@ -103,10 +85,7 @@
         <w:t>Totale ontwikkeltijd:</w:t>
       </w:r>
       <w:r>
-        <w:t xml:space="preserve"> </w:t>
-      </w:r>
-      <w:r>
-        <w:t>5 weken</w:t>
+        <w:t xml:space="preserve"> 5 weken</w:t>
       </w:r>
       <w:r>
         <w:br/>
@@ -147,12 +126,6 @@
         </w:rPr>
         <w:t xml:space="preserve"> 55</w:t>
       </w:r>
-      <w:r>
-        <w:rPr>
-          <w:color w:val="EE0000"/>
-        </w:rPr>
-        <w:t>?</w:t>
-      </w:r>
     </w:p>
     <w:p>
       <w:pPr>
@@ -182,7 +155,7 @@
           <w14:ligatures w14:val="none"/>
         </w:rPr>
         <w:pict w14:anchorId="1A9F9262">
-          <v:rect id="_x0000_i1032" alt="" style="width:451.3pt;height:.05pt;mso-width-percent:0;mso-height-percent:0;mso-width-percent:0;mso-height-percent:0" o:hralign="center" o:hrstd="t" o:hr="t" fillcolor="#a0a0a0" stroked="f"/>
+          <v:rect id="_x0000_i1025" alt="" style="width:451.3pt;height:.05pt;mso-width-percent:0;mso-height-percent:0;mso-width-percent:0;mso-height-percent:0" o:hralign="center" o:hrstd="t" o:hr="t" fillcolor="#a0a0a0" stroked="f"/>
         </w:pict>
       </w:r>
     </w:p>
@@ -975,7 +948,7 @@
           <w14:ligatures w14:val="none"/>
         </w:rPr>
         <w:pict w14:anchorId="76BF86ED">
-          <v:rect id="_x0000_i1033" alt="" style="width:451.3pt;height:.05pt;mso-width-percent:0;mso-height-percent:0;mso-width-percent:0;mso-height-percent:0" o:hralign="center" o:hrstd="t" o:hr="t" fillcolor="#a0a0a0" stroked="f"/>
+          <v:rect id="_x0000_i1026" alt="" style="width:451.3pt;height:.05pt;mso-width-percent:0;mso-height-percent:0;mso-width-percent:0;mso-height-percent:0" o:hralign="center" o:hrstd="t" o:hr="t" fillcolor="#a0a0a0" stroked="f"/>
         </w:pict>
       </w:r>
     </w:p>
@@ -1909,7 +1882,7 @@
           <w14:ligatures w14:val="none"/>
         </w:rPr>
         <w:pict w14:anchorId="2CA81D52">
-          <v:rect id="_x0000_i1034" alt="" style="width:451.3pt;height:.05pt;mso-width-percent:0;mso-height-percent:0;mso-width-percent:0;mso-height-percent:0" o:hralign="center" o:hrstd="t" o:hr="t" fillcolor="#a0a0a0" stroked="f"/>
+          <v:rect id="_x0000_i1027" alt="" style="width:451.3pt;height:.05pt;mso-width-percent:0;mso-height-percent:0;mso-width-percent:0;mso-height-percent:0" o:hralign="center" o:hrstd="t" o:hr="t" fillcolor="#a0a0a0" stroked="f"/>
         </w:pict>
       </w:r>
     </w:p>
@@ -2492,7 +2465,7 @@
           <w14:ligatures w14:val="none"/>
         </w:rPr>
         <w:pict w14:anchorId="4879A9EE">
-          <v:rect id="_x0000_i1035" alt="" style="width:451.3pt;height:.05pt;mso-width-percent:0;mso-height-percent:0;mso-width-percent:0;mso-height-percent:0" o:hralign="center" o:hrstd="t" o:hr="t" fillcolor="#a0a0a0" stroked="f"/>
+          <v:rect id="_x0000_i1028" alt="" style="width:451.3pt;height:.05pt;mso-width-percent:0;mso-height-percent:0;mso-width-percent:0;mso-height-percent:0" o:hralign="center" o:hrstd="t" o:hr="t" fillcolor="#a0a0a0" stroked="f"/>
         </w:pict>
       </w:r>
     </w:p>
@@ -3241,7 +3214,7 @@
           <w14:ligatures w14:val="none"/>
         </w:rPr>
         <w:pict w14:anchorId="7E78F2D0">
-          <v:rect id="_x0000_i1036" alt="" style="width:451.3pt;height:.05pt;mso-width-percent:0;mso-height-percent:0;mso-width-percent:0;mso-height-percent:0" o:hralign="center" o:hrstd="t" o:hr="t" fillcolor="#a0a0a0" stroked="f"/>
+          <v:rect id="_x0000_i1029" alt="" style="width:451.3pt;height:.05pt;mso-width-percent:0;mso-height-percent:0;mso-width-percent:0;mso-height-percent:0" o:hralign="center" o:hrstd="t" o:hr="t" fillcolor="#a0a0a0" stroked="f"/>
         </w:pict>
       </w:r>
     </w:p>
@@ -4206,7 +4179,7 @@
           <w14:ligatures w14:val="none"/>
         </w:rPr>
         <w:pict w14:anchorId="01081039">
-          <v:rect id="_x0000_i1037" alt="" style="width:451.3pt;height:.05pt;mso-width-percent:0;mso-height-percent:0;mso-width-percent:0;mso-height-percent:0" o:hralign="center" o:hrstd="t" o:hr="t" fillcolor="#a0a0a0" stroked="f"/>
+          <v:rect id="_x0000_i1030" alt="" style="width:451.3pt;height:.05pt;mso-width-percent:0;mso-height-percent:0;mso-width-percent:0;mso-height-percent:0" o:hralign="center" o:hrstd="t" o:hr="t" fillcolor="#a0a0a0" stroked="f"/>
         </w:pict>
       </w:r>
     </w:p>
@@ -4748,6 +4721,26 @@
     </w:p>
     <w:p>
       <w:pPr>
+        <w:spacing w:before="100" w:beforeAutospacing="1" w:after="100" w:afterAutospacing="1" w:line="240" w:lineRule="auto"/>
+        <w:rPr>
+          <w:rFonts w:ascii="Times New Roman" w:eastAsia="Times New Roman" w:hAnsi="Times New Roman" w:cs="Times New Roman"/>
+          <w:kern w:val="0"/>
+          <w:lang w:eastAsia="en-GB"/>
+          <w14:ligatures w14:val="none"/>
+        </w:rPr>
+      </w:pPr>
+      <w:r>
+        <w:rPr>
+          <w:rFonts w:ascii="Times New Roman" w:eastAsia="Times New Roman" w:hAnsi="Times New Roman" w:cs="Times New Roman"/>
+          <w:kern w:val="0"/>
+          <w:lang w:eastAsia="en-GB"/>
+          <w14:ligatures w14:val="none"/>
+        </w:rPr>
+        <w:t>Here's the text formatted for easy copy-paste into Word:</w:t>
+      </w:r>
+    </w:p>
+    <w:p>
+      <w:pPr>
         <w:spacing w:after="0" w:line="240" w:lineRule="auto"/>
         <w:rPr>
           <w:rFonts w:ascii="Times New Roman" w:eastAsia="Times New Roman" w:hAnsi="Times New Roman" w:cs="Times New Roman"/>
@@ -4773,22 +4766,39 @@
           <w:lang w:eastAsia="en-GB"/>
           <w14:ligatures w14:val="none"/>
         </w:rPr>
-        <w:pict w14:anchorId="2D631B85">
-          <v:rect id="_x0000_i1038" alt="" style="width:451.3pt;height:.05pt;mso-width-percent:0;mso-height-percent:0;mso-width-percent:0;mso-height-percent:0" o:hralign="center" o:hrstd="t" o:hr="t" fillcolor="#a0a0a0" stroked="f"/>
+        <w:pict w14:anchorId="7A4ADF63">
+          <v:rect id="_x0000_i1033" alt="" style="width:451.3pt;height:.05pt;mso-width-percent:0;mso-height-percent:0;mso-width-percent:0;mso-height-percent:0" o:hralign="center" o:hrstd="t" o:hr="t" fillcolor="#a0a0a0" stroked="f"/>
         </w:pict>
       </w:r>
     </w:p>
     <w:p>
       <w:pPr>
         <w:spacing w:before="100" w:beforeAutospacing="1" w:after="100" w:afterAutospacing="1" w:line="240" w:lineRule="auto"/>
-        <w:outlineLvl w:val="1"/>
+        <w:rPr>
+          <w:rFonts w:ascii="Times New Roman" w:eastAsia="Times New Roman" w:hAnsi="Times New Roman" w:cs="Times New Roman"/>
+          <w:kern w:val="0"/>
+          <w:lang w:eastAsia="en-GB"/>
+          <w14:ligatures w14:val="none"/>
+        </w:rPr>
+      </w:pPr>
+      <w:r>
         <w:rPr>
           <w:rFonts w:ascii="Times New Roman" w:eastAsia="Times New Roman" w:hAnsi="Times New Roman" w:cs="Times New Roman"/>
           <w:b/>
           <w:bCs/>
           <w:kern w:val="0"/>
-          <w:sz w:val="36"/>
-          <w:szCs w:val="36"/>
+          <w:lang w:eastAsia="en-GB"/>
+          <w14:ligatures w14:val="none"/>
+        </w:rPr>
+        <w:t>SAMENVATTING</w:t>
+      </w:r>
+    </w:p>
+    <w:p>
+      <w:pPr>
+        <w:spacing w:before="100" w:beforeAutospacing="1" w:after="100" w:afterAutospacing="1" w:line="240" w:lineRule="auto"/>
+        <w:rPr>
+          <w:rFonts w:ascii="Times New Roman" w:eastAsia="Times New Roman" w:hAnsi="Times New Roman" w:cs="Times New Roman"/>
+          <w:kern w:val="0"/>
           <w:lang w:eastAsia="en-GB"/>
           <w14:ligatures w14:val="none"/>
         </w:rPr>
@@ -4799,43 +4809,50 @@
           <w:b/>
           <w:bCs/>
           <w:kern w:val="0"/>
-          <w:sz w:val="36"/>
-          <w:szCs w:val="36"/>
-          <w:lang w:eastAsia="en-GB"/>
-          <w14:ligatures w14:val="none"/>
-        </w:rPr>
-        <w:t>SAMENVATTING</w:t>
-      </w:r>
-    </w:p>
-    <w:p>
-      <w:pPr>
-        <w:spacing w:before="100" w:beforeAutospacing="1" w:after="100" w:afterAutospacing="1" w:line="240" w:lineRule="auto"/>
-        <w:rPr>
-          <w:rFonts w:ascii="Times New Roman" w:eastAsia="Times New Roman" w:hAnsi="Times New Roman" w:cs="Times New Roman"/>
-          <w:kern w:val="0"/>
-          <w:lang w:eastAsia="en-GB"/>
-          <w14:ligatures w14:val="none"/>
-        </w:rPr>
-      </w:pPr>
+          <w:lang w:eastAsia="en-GB"/>
+          <w14:ligatures w14:val="none"/>
+        </w:rPr>
+        <w:t>Periode:</w:t>
+      </w:r>
+      <w:r>
+        <w:rPr>
+          <w:rFonts w:ascii="Times New Roman" w:eastAsia="Times New Roman" w:hAnsi="Times New Roman" w:cs="Times New Roman"/>
+          <w:kern w:val="0"/>
+          <w:lang w:eastAsia="en-GB"/>
+          <w14:ligatures w14:val="none"/>
+        </w:rPr>
+        <w:t xml:space="preserve"> 30 augustus - 30 september 2025 (1 maand)</w:t>
+      </w:r>
+      <w:r>
+        <w:rPr>
+          <w:rFonts w:ascii="Times New Roman" w:eastAsia="Times New Roman" w:hAnsi="Times New Roman" w:cs="Times New Roman"/>
+          <w:kern w:val="0"/>
+          <w:lang w:eastAsia="en-GB"/>
+          <w14:ligatures w14:val="none"/>
+        </w:rPr>
+        <w:br/>
+      </w:r>
       <w:r>
         <w:rPr>
           <w:rFonts w:ascii="Times New Roman" w:eastAsia="Times New Roman" w:hAnsi="Times New Roman" w:cs="Times New Roman"/>
           <w:b/>
           <w:bCs/>
-          <w:kern w:val="0"/>
-          <w:lang w:eastAsia="en-GB"/>
-          <w14:ligatures w14:val="none"/>
-        </w:rPr>
-        <w:t>Periode:</w:t>
-      </w:r>
-      <w:r>
-        <w:rPr>
-          <w:rFonts w:ascii="Times New Roman" w:eastAsia="Times New Roman" w:hAnsi="Times New Roman" w:cs="Times New Roman"/>
-          <w:kern w:val="0"/>
-          <w:lang w:eastAsia="en-GB"/>
-          <w14:ligatures w14:val="none"/>
-        </w:rPr>
-        <w:t xml:space="preserve"> 30 aug - 29 sep 2025 (1 maand)</w:t>
+          <w:color w:val="EE0000"/>
+          <w:kern w:val="0"/>
+          <w:lang w:eastAsia="en-GB"/>
+          <w14:ligatures w14:val="none"/>
+        </w:rPr>
+        <w:t>Commits:</w:t>
+      </w:r>
+      <w:r>
+        <w:rPr>
+          <w:rFonts w:ascii="Times New Roman" w:eastAsia="Times New Roman" w:hAnsi="Times New Roman" w:cs="Times New Roman"/>
+          <w:color w:val="EE0000"/>
+          <w:kern w:val="0"/>
+          <w:lang w:eastAsia="en-GB"/>
+          <w14:ligatures w14:val="none"/>
+        </w:rPr>
+        <w:t xml:space="preserve"> 66</w:t>
       </w:r>
       <w:r>
         <w:rPr>
@@ -4855,16 +4872,16 @@
           <w:lang w:eastAsia="en-GB"/>
           <w14:ligatures w14:val="none"/>
         </w:rPr>
-        <w:t>Commits:</w:t>
-      </w:r>
-      <w:r>
-        <w:rPr>
-          <w:rFonts w:ascii="Times New Roman" w:eastAsia="Times New Roman" w:hAnsi="Times New Roman" w:cs="Times New Roman"/>
-          <w:kern w:val="0"/>
-          <w:lang w:eastAsia="en-GB"/>
-          <w14:ligatures w14:val="none"/>
-        </w:rPr>
-        <w:t xml:space="preserve"> 55</w:t>
+        <w:t>Actieve dagen:</w:t>
+      </w:r>
+      <w:r>
+        <w:rPr>
+          <w:rFonts w:ascii="Times New Roman" w:eastAsia="Times New Roman" w:hAnsi="Times New Roman" w:cs="Times New Roman"/>
+          <w:kern w:val="0"/>
+          <w:lang w:eastAsia="en-GB"/>
+          <w14:ligatures w14:val="none"/>
+        </w:rPr>
+        <w:t xml:space="preserve"> ~20 dagen</w:t>
       </w:r>
       <w:r>
         <w:rPr>
@@ -4884,26 +4901,80 @@
           <w:lang w:eastAsia="en-GB"/>
           <w14:ligatures w14:val="none"/>
         </w:rPr>
-        <w:t>Actieve dagen:</w:t>
-      </w:r>
-      <w:r>
-        <w:rPr>
-          <w:rFonts w:ascii="Times New Roman" w:eastAsia="Times New Roman" w:hAnsi="Times New Roman" w:cs="Times New Roman"/>
-          <w:kern w:val="0"/>
-          <w:lang w:eastAsia="en-GB"/>
-          <w14:ligatures w14:val="none"/>
-        </w:rPr>
-        <w:t xml:space="preserve"> ~20 dagen</w:t>
-      </w:r>
-      <w:r>
-        <w:rPr>
-          <w:rFonts w:ascii="Times New Roman" w:eastAsia="Times New Roman" w:hAnsi="Times New Roman" w:cs="Times New Roman"/>
-          <w:kern w:val="0"/>
-          <w:lang w:eastAsia="en-GB"/>
-          <w14:ligatures w14:val="none"/>
-        </w:rPr>
-        <w:br/>
-      </w:r>
+        <w:t>Gemiddeld:</w:t>
+      </w:r>
+      <w:r>
+        <w:rPr>
+          <w:rFonts w:ascii="Times New Roman" w:eastAsia="Times New Roman" w:hAnsi="Times New Roman" w:cs="Times New Roman"/>
+          <w:kern w:val="0"/>
+          <w:lang w:eastAsia="en-GB"/>
+          <w14:ligatures w14:val="none"/>
+        </w:rPr>
+        <w:t xml:space="preserve"> 3 commits per actieve dag</w:t>
+      </w:r>
+    </w:p>
+    <w:p>
+      <w:pPr>
+        <w:spacing w:before="100" w:beforeAutospacing="1" w:after="100" w:afterAutospacing="1" w:line="240" w:lineRule="auto"/>
+        <w:rPr>
+          <w:rFonts w:ascii="Times New Roman" w:eastAsia="Times New Roman" w:hAnsi="Times New Roman" w:cs="Times New Roman"/>
+          <w:kern w:val="0"/>
+          <w:lang w:eastAsia="en-GB"/>
+          <w14:ligatures w14:val="none"/>
+        </w:rPr>
+      </w:pPr>
+      <w:r>
+        <w:rPr>
+          <w:rFonts w:ascii="Times New Roman" w:eastAsia="Times New Roman" w:hAnsi="Times New Roman" w:cs="Times New Roman"/>
+          <w:kern w:val="0"/>
+          <w:lang w:eastAsia="en-GB"/>
+          <w14:ligatures w14:val="none"/>
+        </w:rPr>
+        <w:t>Dit project is ontwikkeld over een periode van 1 maand met intensieve development sprints. Het examen heeft een officiële tijdsduur van 2 weken, maar extra tijd is gebruikt voor Enemy AI implementation, polish en documentatie.</w:t>
+      </w:r>
+    </w:p>
+    <w:p>
+      <w:pPr>
+        <w:spacing w:after="0" w:line="240" w:lineRule="auto"/>
+        <w:rPr>
+          <w:rFonts w:ascii="Times New Roman" w:eastAsia="Times New Roman" w:hAnsi="Times New Roman" w:cs="Times New Roman"/>
+          <w:kern w:val="0"/>
+          <w:lang w:eastAsia="en-GB"/>
+          <w14:ligatures w14:val="none"/>
+        </w:rPr>
+      </w:pPr>
+      <w:r>
+        <w:rPr>
+          <w:rFonts w:ascii="Times New Roman" w:eastAsia="Times New Roman" w:hAnsi="Times New Roman" w:cs="Times New Roman"/>
+          <w:noProof/>
+          <w:kern w:val="0"/>
+          <w:lang w:eastAsia="en-GB"/>
+          <w14:ligatures w14:val="none"/>
+        </w:rPr>
+      </w:r>
+      <w:r>
+        <w:rPr>
+          <w:rFonts w:ascii="Times New Roman" w:eastAsia="Times New Roman" w:hAnsi="Times New Roman" w:cs="Times New Roman"/>
+          <w:noProof/>
+          <w:kern w:val="0"/>
+          <w:lang w:eastAsia="en-GB"/>
+          <w14:ligatures w14:val="none"/>
+        </w:rPr>
+        <w:pict w14:anchorId="2568D379">
+          <v:rect id="_x0000_i1034" alt="" style="width:451.3pt;height:.05pt;mso-width-percent:0;mso-height-percent:0;mso-width-percent:0;mso-height-percent:0" o:hralign="center" o:hrstd="t" o:hr="t" fillcolor="#a0a0a0" stroked="f"/>
+        </w:pict>
+      </w:r>
+    </w:p>
+    <w:p>
+      <w:pPr>
+        <w:spacing w:before="100" w:beforeAutospacing="1" w:after="100" w:afterAutospacing="1" w:line="240" w:lineRule="auto"/>
+        <w:rPr>
+          <w:rFonts w:ascii="Times New Roman" w:eastAsia="Times New Roman" w:hAnsi="Times New Roman" w:cs="Times New Roman"/>
+          <w:kern w:val="0"/>
+          <w:lang w:eastAsia="en-GB"/>
+          <w14:ligatures w14:val="none"/>
+        </w:rPr>
+      </w:pPr>
       <w:r>
         <w:rPr>
           <w:rFonts w:ascii="Times New Roman" w:eastAsia="Times New Roman" w:hAnsi="Times New Roman" w:cs="Times New Roman"/>
@@ -4913,16 +4984,7 @@
           <w:lang w:eastAsia="en-GB"/>
           <w14:ligatures w14:val="none"/>
         </w:rPr>
-        <w:t>Gemiddeld:</w:t>
-      </w:r>
-      <w:r>
-        <w:rPr>
-          <w:rFonts w:ascii="Times New Roman" w:eastAsia="Times New Roman" w:hAnsi="Times New Roman" w:cs="Times New Roman"/>
-          <w:kern w:val="0"/>
-          <w:lang w:eastAsia="en-GB"/>
-          <w14:ligatures w14:val="none"/>
-        </w:rPr>
-        <w:t xml:space="preserve"> 2-3 commits per actieve dag</w:t>
+        <w:t>HUIDIGE STATUS (30 september 2025)</w:t>
       </w:r>
     </w:p>
     <w:p>
@@ -4944,61 +5006,322 @@
           <w:lang w:eastAsia="en-GB"/>
           <w14:ligatures w14:val="none"/>
         </w:rPr>
-        <w:t>Dit is een REALISTISCHE tijdlijn voor een 2-weken examen</w:t>
-      </w:r>
-      <w:r>
-        <w:rPr>
-          <w:rFonts w:ascii="Times New Roman" w:eastAsia="Times New Roman" w:hAnsi="Times New Roman" w:cs="Times New Roman"/>
-          <w:kern w:val="0"/>
-          <w:lang w:eastAsia="en-GB"/>
-          <w14:ligatures w14:val="none"/>
-        </w:rPr>
-        <w:t xml:space="preserve"> dat je in 1 maand hebt gedaan (met wat extra tijd).</w:t>
-      </w:r>
-    </w:p>
-    <w:p>
-      <w:pPr>
-        <w:spacing w:after="0" w:line="240" w:lineRule="auto"/>
-        <w:rPr>
-          <w:rFonts w:ascii="Times New Roman" w:eastAsia="Times New Roman" w:hAnsi="Times New Roman" w:cs="Times New Roman"/>
-          <w:kern w:val="0"/>
-          <w:lang w:eastAsia="en-GB"/>
-          <w14:ligatures w14:val="none"/>
-        </w:rPr>
-      </w:pPr>
-      <w:r>
-        <w:rPr>
-          <w:rFonts w:ascii="Times New Roman" w:eastAsia="Times New Roman" w:hAnsi="Times New Roman" w:cs="Times New Roman"/>
-          <w:noProof/>
-          <w:kern w:val="0"/>
-          <w:lang w:eastAsia="en-GB"/>
-          <w14:ligatures w14:val="none"/>
-        </w:rPr>
-      </w:r>
-      <w:r>
-        <w:rPr>
-          <w:rFonts w:ascii="Times New Roman" w:eastAsia="Times New Roman" w:hAnsi="Times New Roman" w:cs="Times New Roman"/>
-          <w:noProof/>
-          <w:kern w:val="0"/>
-          <w:lang w:eastAsia="en-GB"/>
-          <w14:ligatures w14:val="none"/>
-        </w:rPr>
-        <w:pict w14:anchorId="4E239BBA">
-          <v:rect id="_x0000_i1039" alt="" style="width:451.3pt;height:.05pt;mso-width-percent:0;mso-height-percent:0;mso-width-percent:0;mso-height-percent:0" o:hralign="center" o:hrstd="t" o:hr="t" fillcolor="#a0a0a0" stroked="f"/>
-        </w:pict>
-      </w:r>
-    </w:p>
-    <w:p>
-      <w:pPr>
-        <w:spacing w:before="100" w:beforeAutospacing="1" w:after="100" w:afterAutospacing="1" w:line="240" w:lineRule="auto"/>
-        <w:outlineLvl w:val="1"/>
-        <w:rPr>
-          <w:rFonts w:ascii="Times New Roman" w:eastAsia="Times New Roman" w:hAnsi="Times New Roman" w:cs="Times New Roman"/>
+        <w:t xml:space="preserve">VOLTOOID </w:t>
+      </w:r>
+      <w:r>
+        <w:rPr>
+          <w:rFonts w:ascii="Segoe UI Symbol" w:eastAsia="Times New Roman" w:hAnsi="Segoe UI Symbol" w:cs="Segoe UI Symbol"/>
           <w:b/>
           <w:bCs/>
           <w:kern w:val="0"/>
-          <w:sz w:val="36"/>
-          <w:szCs w:val="36"/>
+          <w:lang w:eastAsia="en-GB"/>
+          <w14:ligatures w14:val="none"/>
+        </w:rPr>
+        <w:t>✓</w:t>
+      </w:r>
+    </w:p>
+    <w:p>
+      <w:pPr>
+        <w:numPr>
+          <w:ilvl w:val="0"/>
+          <w:numId w:val="18"/>
+        </w:numPr>
+        <w:spacing w:before="100" w:beforeAutospacing="1" w:after="100" w:afterAutospacing="1" w:line="240" w:lineRule="auto"/>
+        <w:rPr>
+          <w:rFonts w:ascii="Times New Roman" w:eastAsia="Times New Roman" w:hAnsi="Times New Roman" w:cs="Times New Roman"/>
+          <w:kern w:val="0"/>
+          <w:lang w:eastAsia="en-GB"/>
+          <w14:ligatures w14:val="none"/>
+        </w:rPr>
+      </w:pPr>
+      <w:r>
+        <w:rPr>
+          <w:rFonts w:ascii="Segoe UI Symbol" w:eastAsia="Times New Roman" w:hAnsi="Segoe UI Symbol" w:cs="Segoe UI Symbol"/>
+          <w:kern w:val="0"/>
+          <w:lang w:eastAsia="en-GB"/>
+          <w14:ligatures w14:val="none"/>
+        </w:rPr>
+        <w:t>✓</w:t>
+      </w:r>
+      <w:r>
+        <w:rPr>
+          <w:rFonts w:ascii="Times New Roman" w:eastAsia="Times New Roman" w:hAnsi="Times New Roman" w:cs="Times New Roman"/>
+          <w:kern w:val="0"/>
+          <w:lang w:eastAsia="en-GB"/>
+          <w14:ligatures w14:val="none"/>
+        </w:rPr>
+        <w:t xml:space="preserve"> Core gameplay (Player movement, combat, health)</w:t>
+      </w:r>
+    </w:p>
+    <w:p>
+      <w:pPr>
+        <w:numPr>
+          <w:ilvl w:val="0"/>
+          <w:numId w:val="18"/>
+        </w:numPr>
+        <w:spacing w:before="100" w:beforeAutospacing="1" w:after="100" w:afterAutospacing="1" w:line="240" w:lineRule="auto"/>
+        <w:rPr>
+          <w:rFonts w:ascii="Times New Roman" w:eastAsia="Times New Roman" w:hAnsi="Times New Roman" w:cs="Times New Roman"/>
+          <w:kern w:val="0"/>
+          <w:lang w:eastAsia="en-GB"/>
+          <w14:ligatures w14:val="none"/>
+        </w:rPr>
+      </w:pPr>
+      <w:r>
+        <w:rPr>
+          <w:rFonts w:ascii="Segoe UI Symbol" w:eastAsia="Times New Roman" w:hAnsi="Segoe UI Symbol" w:cs="Segoe UI Symbol"/>
+          <w:kern w:val="0"/>
+          <w:lang w:eastAsia="en-GB"/>
+          <w14:ligatures w14:val="none"/>
+        </w:rPr>
+        <w:t>✓</w:t>
+      </w:r>
+      <w:r>
+        <w:rPr>
+          <w:rFonts w:ascii="Times New Roman" w:eastAsia="Times New Roman" w:hAnsi="Times New Roman" w:cs="Times New Roman"/>
+          <w:kern w:val="0"/>
+          <w:lang w:eastAsia="en-GB"/>
+          <w14:ligatures w14:val="none"/>
+        </w:rPr>
+        <w:t xml:space="preserve"> Enemy AI state machine (COMPLEET - vandaag!)</w:t>
+      </w:r>
+    </w:p>
+    <w:p>
+      <w:pPr>
+        <w:numPr>
+          <w:ilvl w:val="0"/>
+          <w:numId w:val="18"/>
+        </w:numPr>
+        <w:spacing w:before="100" w:beforeAutospacing="1" w:after="100" w:afterAutospacing="1" w:line="240" w:lineRule="auto"/>
+        <w:rPr>
+          <w:rFonts w:ascii="Times New Roman" w:eastAsia="Times New Roman" w:hAnsi="Times New Roman" w:cs="Times New Roman"/>
+          <w:kern w:val="0"/>
+          <w:lang w:eastAsia="en-GB"/>
+          <w14:ligatures w14:val="none"/>
+        </w:rPr>
+      </w:pPr>
+      <w:r>
+        <w:rPr>
+          <w:rFonts w:ascii="Segoe UI Symbol" w:eastAsia="Times New Roman" w:hAnsi="Segoe UI Symbol" w:cs="Segoe UI Symbol"/>
+          <w:kern w:val="0"/>
+          <w:lang w:eastAsia="en-GB"/>
+          <w14:ligatures w14:val="none"/>
+        </w:rPr>
+        <w:t>✓</w:t>
+      </w:r>
+      <w:r>
+        <w:rPr>
+          <w:rFonts w:ascii="Times New Roman" w:eastAsia="Times New Roman" w:hAnsi="Times New Roman" w:cs="Times New Roman"/>
+          <w:kern w:val="0"/>
+          <w:lang w:eastAsia="en-GB"/>
+          <w14:ligatures w14:val="none"/>
+        </w:rPr>
+        <w:t xml:space="preserve"> Stats &amp; leveling system</w:t>
+      </w:r>
+    </w:p>
+    <w:p>
+      <w:pPr>
+        <w:numPr>
+          <w:ilvl w:val="0"/>
+          <w:numId w:val="18"/>
+        </w:numPr>
+        <w:spacing w:before="100" w:beforeAutospacing="1" w:after="100" w:afterAutospacing="1" w:line="240" w:lineRule="auto"/>
+        <w:rPr>
+          <w:rFonts w:ascii="Times New Roman" w:eastAsia="Times New Roman" w:hAnsi="Times New Roman" w:cs="Times New Roman"/>
+          <w:kern w:val="0"/>
+          <w:lang w:eastAsia="en-GB"/>
+          <w14:ligatures w14:val="none"/>
+        </w:rPr>
+      </w:pPr>
+      <w:r>
+        <w:rPr>
+          <w:rFonts w:ascii="Segoe UI Symbol" w:eastAsia="Times New Roman" w:hAnsi="Segoe UI Symbol" w:cs="Segoe UI Symbol"/>
+          <w:kern w:val="0"/>
+          <w:lang w:eastAsia="en-GB"/>
+          <w14:ligatures w14:val="none"/>
+        </w:rPr>
+        <w:t>✓</w:t>
+      </w:r>
+      <w:r>
+        <w:rPr>
+          <w:rFonts w:ascii="Times New Roman" w:eastAsia="Times New Roman" w:hAnsi="Times New Roman" w:cs="Times New Roman"/>
+          <w:kern w:val="0"/>
+          <w:lang w:eastAsia="en-GB"/>
+          <w14:ligatures w14:val="none"/>
+        </w:rPr>
+        <w:t xml:space="preserve"> Enemy scaling system</w:t>
+      </w:r>
+    </w:p>
+    <w:p>
+      <w:pPr>
+        <w:numPr>
+          <w:ilvl w:val="0"/>
+          <w:numId w:val="18"/>
+        </w:numPr>
+        <w:spacing w:before="100" w:beforeAutospacing="1" w:after="100" w:afterAutospacing="1" w:line="240" w:lineRule="auto"/>
+        <w:rPr>
+          <w:rFonts w:ascii="Times New Roman" w:eastAsia="Times New Roman" w:hAnsi="Times New Roman" w:cs="Times New Roman"/>
+          <w:kern w:val="0"/>
+          <w:lang w:eastAsia="en-GB"/>
+          <w14:ligatures w14:val="none"/>
+        </w:rPr>
+      </w:pPr>
+      <w:r>
+        <w:rPr>
+          <w:rFonts w:ascii="Segoe UI Symbol" w:eastAsia="Times New Roman" w:hAnsi="Segoe UI Symbol" w:cs="Segoe UI Symbol"/>
+          <w:kern w:val="0"/>
+          <w:lang w:eastAsia="en-GB"/>
+          <w14:ligatures w14:val="none"/>
+        </w:rPr>
+        <w:t>✓</w:t>
+      </w:r>
+      <w:r>
+        <w:rPr>
+          <w:rFonts w:ascii="Times New Roman" w:eastAsia="Times New Roman" w:hAnsi="Times New Roman" w:cs="Times New Roman"/>
+          <w:kern w:val="0"/>
+          <w:lang w:eastAsia="en-GB"/>
+          <w14:ligatures w14:val="none"/>
+        </w:rPr>
+        <w:t xml:space="preserve"> Scene management</w:t>
+      </w:r>
+    </w:p>
+    <w:p>
+      <w:pPr>
+        <w:numPr>
+          <w:ilvl w:val="0"/>
+          <w:numId w:val="18"/>
+        </w:numPr>
+        <w:spacing w:before="100" w:beforeAutospacing="1" w:after="100" w:afterAutospacing="1" w:line="240" w:lineRule="auto"/>
+        <w:rPr>
+          <w:rFonts w:ascii="Times New Roman" w:eastAsia="Times New Roman" w:hAnsi="Times New Roman" w:cs="Times New Roman"/>
+          <w:kern w:val="0"/>
+          <w:lang w:eastAsia="en-GB"/>
+          <w14:ligatures w14:val="none"/>
+        </w:rPr>
+      </w:pPr>
+      <w:r>
+        <w:rPr>
+          <w:rFonts w:ascii="Segoe UI Symbol" w:eastAsia="Times New Roman" w:hAnsi="Segoe UI Symbol" w:cs="Segoe UI Symbol"/>
+          <w:kern w:val="0"/>
+          <w:lang w:eastAsia="en-GB"/>
+          <w14:ligatures w14:val="none"/>
+        </w:rPr>
+        <w:t>✓</w:t>
+      </w:r>
+      <w:r>
+        <w:rPr>
+          <w:rFonts w:ascii="Times New Roman" w:eastAsia="Times New Roman" w:hAnsi="Times New Roman" w:cs="Times New Roman"/>
+          <w:kern w:val="0"/>
+          <w:lang w:eastAsia="en-GB"/>
+          <w14:ligatures w14:val="none"/>
+        </w:rPr>
+        <w:t xml:space="preserve"> UI displays</w:t>
+      </w:r>
+    </w:p>
+    <w:p>
+      <w:pPr>
+        <w:numPr>
+          <w:ilvl w:val="0"/>
+          <w:numId w:val="18"/>
+        </w:numPr>
+        <w:spacing w:before="100" w:beforeAutospacing="1" w:after="100" w:afterAutospacing="1" w:line="240" w:lineRule="auto"/>
+        <w:rPr>
+          <w:rFonts w:ascii="Times New Roman" w:eastAsia="Times New Roman" w:hAnsi="Times New Roman" w:cs="Times New Roman"/>
+          <w:kern w:val="0"/>
+          <w:lang w:eastAsia="en-GB"/>
+          <w14:ligatures w14:val="none"/>
+        </w:rPr>
+      </w:pPr>
+      <w:r>
+        <w:rPr>
+          <w:rFonts w:ascii="Segoe UI Symbol" w:eastAsia="Times New Roman" w:hAnsi="Segoe UI Symbol" w:cs="Segoe UI Symbol"/>
+          <w:kern w:val="0"/>
+          <w:lang w:eastAsia="en-GB"/>
+          <w14:ligatures w14:val="none"/>
+        </w:rPr>
+        <w:t>✓</w:t>
+      </w:r>
+      <w:r>
+        <w:rPr>
+          <w:rFonts w:ascii="Times New Roman" w:eastAsia="Times New Roman" w:hAnsi="Times New Roman" w:cs="Times New Roman"/>
+          <w:kern w:val="0"/>
+          <w:lang w:eastAsia="en-GB"/>
+          <w14:ligatures w14:val="none"/>
+        </w:rPr>
+        <w:t xml:space="preserve"> Visual feedback systems</w:t>
+      </w:r>
+    </w:p>
+    <w:p>
+      <w:pPr>
+        <w:numPr>
+          <w:ilvl w:val="0"/>
+          <w:numId w:val="18"/>
+        </w:numPr>
+        <w:spacing w:before="100" w:beforeAutospacing="1" w:after="100" w:afterAutospacing="1" w:line="240" w:lineRule="auto"/>
+        <w:rPr>
+          <w:rFonts w:ascii="Times New Roman" w:eastAsia="Times New Roman" w:hAnsi="Times New Roman" w:cs="Times New Roman"/>
+          <w:kern w:val="0"/>
+          <w:lang w:eastAsia="en-GB"/>
+          <w14:ligatures w14:val="none"/>
+        </w:rPr>
+      </w:pPr>
+      <w:r>
+        <w:rPr>
+          <w:rFonts w:ascii="Segoe UI Symbol" w:eastAsia="Times New Roman" w:hAnsi="Segoe UI Symbol" w:cs="Segoe UI Symbol"/>
+          <w:kern w:val="0"/>
+          <w:lang w:eastAsia="en-GB"/>
+          <w14:ligatures w14:val="none"/>
+        </w:rPr>
+        <w:t>✓</w:t>
+      </w:r>
+      <w:r>
+        <w:rPr>
+          <w:rFonts w:ascii="Times New Roman" w:eastAsia="Times New Roman" w:hAnsi="Times New Roman" w:cs="Times New Roman"/>
+          <w:kern w:val="0"/>
+          <w:lang w:eastAsia="en-GB"/>
+          <w14:ligatures w14:val="none"/>
+        </w:rPr>
+        <w:t xml:space="preserve"> Documentatie basis (Logboek concept, Ontwikkelomgeving)</w:t>
+      </w:r>
+    </w:p>
+    <w:p>
+      <w:pPr>
+        <w:spacing w:after="0" w:line="240" w:lineRule="auto"/>
+        <w:rPr>
+          <w:rFonts w:ascii="Times New Roman" w:eastAsia="Times New Roman" w:hAnsi="Times New Roman" w:cs="Times New Roman"/>
+          <w:kern w:val="0"/>
+          <w:lang w:eastAsia="en-GB"/>
+          <w14:ligatures w14:val="none"/>
+        </w:rPr>
+      </w:pPr>
+      <w:r>
+        <w:rPr>
+          <w:rFonts w:ascii="Times New Roman" w:eastAsia="Times New Roman" w:hAnsi="Times New Roman" w:cs="Times New Roman"/>
+          <w:noProof/>
+          <w:kern w:val="0"/>
+          <w:lang w:eastAsia="en-GB"/>
+          <w14:ligatures w14:val="none"/>
+        </w:rPr>
+      </w:r>
+      <w:r>
+        <w:rPr>
+          <w:rFonts w:ascii="Times New Roman" w:eastAsia="Times New Roman" w:hAnsi="Times New Roman" w:cs="Times New Roman"/>
+          <w:noProof/>
+          <w:kern w:val="0"/>
+          <w:lang w:eastAsia="en-GB"/>
+          <w14:ligatures w14:val="none"/>
+        </w:rPr>
+        <w:pict w14:anchorId="4185A232">
+          <v:rect id="_x0000_i1035" alt="" style="width:451.3pt;height:.05pt;mso-width-percent:0;mso-height-percent:0;mso-width-percent:0;mso-height-percent:0" o:hralign="center" o:hrstd="t" o:hr="t" fillcolor="#a0a0a0" stroked="f"/>
+        </w:pict>
+      </w:r>
+    </w:p>
+    <w:p>
+      <w:pPr>
+        <w:spacing w:before="100" w:beforeAutospacing="1" w:after="100" w:afterAutospacing="1" w:line="240" w:lineRule="auto"/>
+        <w:rPr>
+          <w:rFonts w:ascii="Times New Roman" w:eastAsia="Times New Roman" w:hAnsi="Times New Roman" w:cs="Times New Roman"/>
+          <w:kern w:val="0"/>
           <w:lang w:eastAsia="en-GB"/>
           <w14:ligatures w14:val="none"/>
         </w:rPr>
@@ -5009,33 +5332,22 @@
           <w:b/>
           <w:bCs/>
           <w:kern w:val="0"/>
-          <w:sz w:val="36"/>
-          <w:szCs w:val="36"/>
-          <w:lang w:eastAsia="en-GB"/>
-          <w14:ligatures w14:val="none"/>
-        </w:rPr>
-        <w:t>NOG TE DOEN (URGENT)</w:t>
-      </w:r>
-    </w:p>
-    <w:p>
-      <w:pPr>
-        <w:spacing w:before="100" w:beforeAutospacing="1" w:after="100" w:afterAutospacing="1" w:line="240" w:lineRule="auto"/>
-        <w:rPr>
-          <w:rFonts w:ascii="Times New Roman" w:eastAsia="Times New Roman" w:hAnsi="Times New Roman" w:cs="Times New Roman"/>
-          <w:kern w:val="0"/>
-          <w:lang w:eastAsia="en-GB"/>
-          <w14:ligatures w14:val="none"/>
-        </w:rPr>
-      </w:pPr>
-      <w:r>
-        <w:rPr>
-          <w:rFonts w:ascii="Times New Roman" w:eastAsia="Times New Roman" w:hAnsi="Times New Roman" w:cs="Times New Roman"/>
-          <w:kern w:val="0"/>
-          <w:lang w:eastAsia="en-GB"/>
-          <w14:ligatures w14:val="none"/>
-        </w:rPr>
-        <w:t xml:space="preserve">Je presentatie is waarschijnlijk </w:t>
-      </w:r>
+          <w:lang w:eastAsia="en-GB"/>
+          <w14:ligatures w14:val="none"/>
+        </w:rPr>
+        <w:t>SEPTEMBER 2025 - Dag 15 (30 september) - ENEMY AI COMPLETION DAY</w:t>
+      </w:r>
+    </w:p>
+    <w:p>
+      <w:pPr>
+        <w:spacing w:before="100" w:beforeAutospacing="1" w:after="100" w:afterAutospacing="1" w:line="240" w:lineRule="auto"/>
+        <w:rPr>
+          <w:rFonts w:ascii="Times New Roman" w:eastAsia="Times New Roman" w:hAnsi="Times New Roman" w:cs="Times New Roman"/>
+          <w:kern w:val="0"/>
+          <w:lang w:eastAsia="en-GB"/>
+          <w14:ligatures w14:val="none"/>
+        </w:rPr>
+      </w:pPr>
       <w:r>
         <w:rPr>
           <w:rFonts w:ascii="Times New Roman" w:eastAsia="Times New Roman" w:hAnsi="Times New Roman" w:cs="Times New Roman"/>
@@ -5045,52 +5357,475 @@
           <w:lang w:eastAsia="en-GB"/>
           <w14:ligatures w14:val="none"/>
         </w:rPr>
-        <w:t>deze of volgende week</w:t>
-      </w:r>
-      <w:r>
-        <w:rPr>
-          <w:rFonts w:ascii="Times New Roman" w:eastAsia="Times New Roman" w:hAnsi="Times New Roman" w:cs="Times New Roman"/>
-          <w:kern w:val="0"/>
-          <w:lang w:eastAsia="en-GB"/>
-          <w14:ligatures w14:val="none"/>
-        </w:rPr>
-        <w:t>!</w:t>
-      </w:r>
-    </w:p>
-    <w:p>
-      <w:pPr>
-        <w:spacing w:before="100" w:beforeAutospacing="1" w:after="100" w:afterAutospacing="1" w:line="240" w:lineRule="auto"/>
-        <w:outlineLvl w:val="2"/>
+        <w:t>Commits:</w:t>
+      </w:r>
+      <w:r>
+        <w:rPr>
+          <w:rFonts w:ascii="Times New Roman" w:eastAsia="Times New Roman" w:hAnsi="Times New Roman" w:cs="Times New Roman"/>
+          <w:kern w:val="0"/>
+          <w:lang w:eastAsia="en-GB"/>
+          <w14:ligatures w14:val="none"/>
+        </w:rPr>
+        <w:t xml:space="preserve"> 11</w:t>
+      </w:r>
+      <w:r>
+        <w:rPr>
+          <w:rFonts w:ascii="Times New Roman" w:eastAsia="Times New Roman" w:hAnsi="Times New Roman" w:cs="Times New Roman"/>
+          <w:kern w:val="0"/>
+          <w:lang w:eastAsia="en-GB"/>
+          <w14:ligatures w14:val="none"/>
+        </w:rPr>
+        <w:br/>
+      </w:r>
+      <w:r>
         <w:rPr>
           <w:rFonts w:ascii="Times New Roman" w:eastAsia="Times New Roman" w:hAnsi="Times New Roman" w:cs="Times New Roman"/>
           <w:b/>
           <w:bCs/>
           <w:kern w:val="0"/>
-          <w:sz w:val="27"/>
-          <w:szCs w:val="27"/>
-          <w:lang w:eastAsia="en-GB"/>
-          <w14:ligatures w14:val="none"/>
-        </w:rPr>
-      </w:pPr>
+          <w:lang w:eastAsia="en-GB"/>
+          <w14:ligatures w14:val="none"/>
+        </w:rPr>
+        <w:t>Tijd besteed:</w:t>
+      </w:r>
+      <w:r>
+        <w:rPr>
+          <w:rFonts w:ascii="Times New Roman" w:eastAsia="Times New Roman" w:hAnsi="Times New Roman" w:cs="Times New Roman"/>
+          <w:kern w:val="0"/>
+          <w:lang w:eastAsia="en-GB"/>
+          <w14:ligatures w14:val="none"/>
+        </w:rPr>
+        <w:t xml:space="preserve"> 8 uur</w:t>
+      </w:r>
+      <w:r>
+        <w:rPr>
+          <w:rFonts w:ascii="Times New Roman" w:eastAsia="Times New Roman" w:hAnsi="Times New Roman" w:cs="Times New Roman"/>
+          <w:kern w:val="0"/>
+          <w:lang w:eastAsia="en-GB"/>
+          <w14:ligatures w14:val="none"/>
+        </w:rPr>
+        <w:br/>
+      </w:r>
       <w:r>
         <w:rPr>
           <w:rFonts w:ascii="Times New Roman" w:eastAsia="Times New Roman" w:hAnsi="Times New Roman" w:cs="Times New Roman"/>
           <w:b/>
           <w:bCs/>
           <w:kern w:val="0"/>
-          <w:sz w:val="27"/>
-          <w:szCs w:val="27"/>
-          <w:lang w:eastAsia="en-GB"/>
-          <w14:ligatures w14:val="none"/>
-        </w:rPr>
-        <w:t>KRITISCH:</w:t>
+          <w:lang w:eastAsia="en-GB"/>
+          <w14:ligatures w14:val="none"/>
+        </w:rPr>
+        <w:t>Status:</w:t>
+      </w:r>
+      <w:r>
+        <w:rPr>
+          <w:rFonts w:ascii="Times New Roman" w:eastAsia="Times New Roman" w:hAnsi="Times New Roman" w:cs="Times New Roman"/>
+          <w:kern w:val="0"/>
+          <w:lang w:eastAsia="en-GB"/>
+          <w14:ligatures w14:val="none"/>
+        </w:rPr>
+        <w:t xml:space="preserve"> MAJOR MILESTONE - Enemy AI volledig geïmplementeerd</w:t>
+      </w:r>
+    </w:p>
+    <w:p>
+      <w:pPr>
+        <w:spacing w:before="100" w:beforeAutospacing="1" w:after="100" w:afterAutospacing="1" w:line="240" w:lineRule="auto"/>
+        <w:rPr>
+          <w:rFonts w:ascii="Times New Roman" w:eastAsia="Times New Roman" w:hAnsi="Times New Roman" w:cs="Times New Roman"/>
+          <w:kern w:val="0"/>
+          <w:lang w:eastAsia="en-GB"/>
+          <w14:ligatures w14:val="none"/>
+        </w:rPr>
+      </w:pPr>
+      <w:r>
+        <w:rPr>
+          <w:rFonts w:ascii="Times New Roman" w:eastAsia="Times New Roman" w:hAnsi="Times New Roman" w:cs="Times New Roman"/>
+          <w:kern w:val="0"/>
+          <w:lang w:eastAsia="en-GB"/>
+          <w14:ligatures w14:val="none"/>
+        </w:rPr>
+        <w:t>Dit was de belangrijkste dag van het hele project. Van een lege EnemyAI.cs template naar een volledig functionele state machine met patrol, chase, attack en idle behaviors.</w:t>
+      </w:r>
+      <w:r>
+        <w:rPr>
+          <w:rFonts w:ascii="Times New Roman" w:eastAsia="Times New Roman" w:hAnsi="Times New Roman" w:cs="Times New Roman"/>
+          <w:kern w:val="0"/>
+          <w:lang w:eastAsia="en-GB"/>
+          <w14:ligatures w14:val="none"/>
+        </w:rPr>
+        <w:t xml:space="preserve"> De attack is niet voledige klaar.</w:t>
+      </w:r>
+    </w:p>
+    <w:p>
+      <w:pPr>
+        <w:spacing w:before="100" w:beforeAutospacing="1" w:after="100" w:afterAutospacing="1" w:line="240" w:lineRule="auto"/>
+        <w:rPr>
+          <w:rFonts w:ascii="Times New Roman" w:eastAsia="Times New Roman" w:hAnsi="Times New Roman" w:cs="Times New Roman"/>
+          <w:kern w:val="0"/>
+          <w:lang w:eastAsia="en-GB"/>
+          <w14:ligatures w14:val="none"/>
+        </w:rPr>
+      </w:pPr>
+      <w:r>
+        <w:rPr>
+          <w:rFonts w:ascii="Times New Roman" w:eastAsia="Times New Roman" w:hAnsi="Times New Roman" w:cs="Times New Roman"/>
+          <w:b/>
+          <w:bCs/>
+          <w:kern w:val="0"/>
+          <w:lang w:eastAsia="en-GB"/>
+          <w14:ligatures w14:val="none"/>
+        </w:rPr>
+        <w:t>Chronologische ontwikkeling:</w:t>
+      </w:r>
+    </w:p>
+    <w:p>
+      <w:pPr>
+        <w:spacing w:before="100" w:beforeAutospacing="1" w:after="100" w:afterAutospacing="1" w:line="240" w:lineRule="auto"/>
+        <w:rPr>
+          <w:rFonts w:ascii="Times New Roman" w:eastAsia="Times New Roman" w:hAnsi="Times New Roman" w:cs="Times New Roman"/>
+          <w:kern w:val="0"/>
+          <w:lang w:eastAsia="en-GB"/>
+          <w14:ligatures w14:val="none"/>
+        </w:rPr>
+      </w:pPr>
+      <w:r>
+        <w:rPr>
+          <w:rFonts w:ascii="Times New Roman" w:eastAsia="Times New Roman" w:hAnsi="Times New Roman" w:cs="Times New Roman"/>
+          <w:kern w:val="0"/>
+          <w:lang w:eastAsia="en-GB"/>
+          <w14:ligatures w14:val="none"/>
+        </w:rPr>
+        <w:lastRenderedPageBreak/>
+        <w:t>10:11 - Feat: enhance enemyai with patrol and detection features</w:t>
+      </w:r>
+      <w:r>
+        <w:rPr>
+          <w:rFonts w:ascii="Times New Roman" w:eastAsia="Times New Roman" w:hAnsi="Times New Roman" w:cs="Times New Roman"/>
+          <w:kern w:val="0"/>
+          <w:lang w:eastAsia="en-GB"/>
+          <w14:ligatures w14:val="none"/>
+        </w:rPr>
+        <w:br/>
+        <w:t>BASIS: Patrol movement + player detection range</w:t>
+      </w:r>
+    </w:p>
+    <w:p>
+      <w:pPr>
+        <w:spacing w:before="100" w:beforeAutospacing="1" w:after="100" w:afterAutospacing="1" w:line="240" w:lineRule="auto"/>
+        <w:rPr>
+          <w:rFonts w:ascii="Times New Roman" w:eastAsia="Times New Roman" w:hAnsi="Times New Roman" w:cs="Times New Roman"/>
+          <w:kern w:val="0"/>
+          <w:lang w:eastAsia="en-GB"/>
+          <w14:ligatures w14:val="none"/>
+        </w:rPr>
+      </w:pPr>
+      <w:r>
+        <w:rPr>
+          <w:rFonts w:ascii="Times New Roman" w:eastAsia="Times New Roman" w:hAnsi="Times New Roman" w:cs="Times New Roman"/>
+          <w:kern w:val="0"/>
+          <w:lang w:eastAsia="en-GB"/>
+          <w14:ligatures w14:val="none"/>
+        </w:rPr>
+        <w:t>10:16 - Feat: add new enemy behavior component and safety checks</w:t>
+      </w:r>
+      <w:r>
+        <w:rPr>
+          <w:rFonts w:ascii="Times New Roman" w:eastAsia="Times New Roman" w:hAnsi="Times New Roman" w:cs="Times New Roman"/>
+          <w:kern w:val="0"/>
+          <w:lang w:eastAsia="en-GB"/>
+          <w14:ligatures w14:val="none"/>
+        </w:rPr>
+        <w:br/>
+        <w:t>VEILIGHEID: Null checks voor player reference</w:t>
+      </w:r>
+    </w:p>
+    <w:p>
+      <w:pPr>
+        <w:spacing w:before="100" w:beforeAutospacing="1" w:after="100" w:afterAutospacing="1" w:line="240" w:lineRule="auto"/>
+        <w:rPr>
+          <w:rFonts w:ascii="Times New Roman" w:eastAsia="Times New Roman" w:hAnsi="Times New Roman" w:cs="Times New Roman"/>
+          <w:kern w:val="0"/>
+          <w:lang w:eastAsia="en-GB"/>
+          <w14:ligatures w14:val="none"/>
+        </w:rPr>
+      </w:pPr>
+      <w:r>
+        <w:rPr>
+          <w:rFonts w:ascii="Times New Roman" w:eastAsia="Times New Roman" w:hAnsi="Times New Roman" w:cs="Times New Roman"/>
+          <w:kern w:val="0"/>
+          <w:lang w:eastAsia="en-GB"/>
+          <w14:ligatures w14:val="none"/>
+        </w:rPr>
+        <w:t>12:08 - Feat: implement patrol behavior and state management</w:t>
+      </w:r>
+      <w:r>
+        <w:rPr>
+          <w:rFonts w:ascii="Times New Roman" w:eastAsia="Times New Roman" w:hAnsi="Times New Roman" w:cs="Times New Roman"/>
+          <w:kern w:val="0"/>
+          <w:lang w:eastAsia="en-GB"/>
+          <w14:ligatures w14:val="none"/>
+        </w:rPr>
+        <w:br/>
+        <w:t>STATE MACHINE: Eerste versie Patrol/Chase states</w:t>
+      </w:r>
+    </w:p>
+    <w:p>
+      <w:pPr>
+        <w:spacing w:before="100" w:beforeAutospacing="1" w:after="100" w:afterAutospacing="1" w:line="240" w:lineRule="auto"/>
+        <w:rPr>
+          <w:rFonts w:ascii="Times New Roman" w:eastAsia="Times New Roman" w:hAnsi="Times New Roman" w:cs="Times New Roman"/>
+          <w:kern w:val="0"/>
+          <w:lang w:eastAsia="en-GB"/>
+          <w14:ligatures w14:val="none"/>
+        </w:rPr>
+      </w:pPr>
+      <w:r>
+        <w:rPr>
+          <w:rFonts w:ascii="Times New Roman" w:eastAsia="Times New Roman" w:hAnsi="Times New Roman" w:cs="Times New Roman"/>
+          <w:kern w:val="0"/>
+          <w:lang w:eastAsia="en-GB"/>
+          <w14:ligatures w14:val="none"/>
+        </w:rPr>
+        <w:t>12:13 - feat: add comments to enemy ai parameters</w:t>
+      </w:r>
+      <w:r>
+        <w:rPr>
+          <w:rFonts w:ascii="Times New Roman" w:eastAsia="Times New Roman" w:hAnsi="Times New Roman" w:cs="Times New Roman"/>
+          <w:kern w:val="0"/>
+          <w:lang w:eastAsia="en-GB"/>
+          <w14:ligatures w14:val="none"/>
+        </w:rPr>
+        <w:br/>
+        <w:t>DOCUMENTATIE: Alle parameters toegelicht</w:t>
+      </w:r>
+    </w:p>
+    <w:p>
+      <w:pPr>
+        <w:spacing w:before="100" w:beforeAutospacing="1" w:after="100" w:afterAutospacing="1" w:line="240" w:lineRule="auto"/>
+        <w:rPr>
+          <w:rFonts w:ascii="Times New Roman" w:eastAsia="Times New Roman" w:hAnsi="Times New Roman" w:cs="Times New Roman"/>
+          <w:kern w:val="0"/>
+          <w:lang w:eastAsia="en-GB"/>
+          <w14:ligatures w14:val="none"/>
+        </w:rPr>
+      </w:pPr>
+      <w:r>
+        <w:rPr>
+          <w:rFonts w:ascii="Times New Roman" w:eastAsia="Times New Roman" w:hAnsi="Times New Roman" w:cs="Times New Roman"/>
+          <w:kern w:val="0"/>
+          <w:lang w:eastAsia="en-GB"/>
+          <w14:ligatures w14:val="none"/>
+        </w:rPr>
+        <w:t>13:28 - feat: refine enemy ai with improved state management</w:t>
+      </w:r>
+      <w:r>
+        <w:rPr>
+          <w:rFonts w:ascii="Times New Roman" w:eastAsia="Times New Roman" w:hAnsi="Times New Roman" w:cs="Times New Roman"/>
+          <w:kern w:val="0"/>
+          <w:lang w:eastAsia="en-GB"/>
+          <w14:ligatures w14:val="none"/>
+        </w:rPr>
+        <w:br/>
+        <w:t>VERFIJNING: Patrol → Chase → Attack transitions</w:t>
+      </w:r>
+    </w:p>
+    <w:p>
+      <w:pPr>
+        <w:spacing w:before="100" w:beforeAutospacing="1" w:after="100" w:afterAutospacing="1" w:line="240" w:lineRule="auto"/>
+        <w:rPr>
+          <w:rFonts w:ascii="Times New Roman" w:eastAsia="Times New Roman" w:hAnsi="Times New Roman" w:cs="Times New Roman"/>
+          <w:kern w:val="0"/>
+          <w:lang w:eastAsia="en-GB"/>
+          <w14:ligatures w14:val="none"/>
+        </w:rPr>
+      </w:pPr>
+      <w:r>
+        <w:rPr>
+          <w:rFonts w:ascii="Times New Roman" w:eastAsia="Times New Roman" w:hAnsi="Times New Roman" w:cs="Times New Roman"/>
+          <w:kern w:val="0"/>
+          <w:lang w:eastAsia="en-GB"/>
+          <w14:ligatures w14:val="none"/>
+        </w:rPr>
+        <w:t>13:49 - Enhance enemy ai with refined attack and Idle state management</w:t>
+      </w:r>
+      <w:r>
+        <w:rPr>
+          <w:rFonts w:ascii="Times New Roman" w:eastAsia="Times New Roman" w:hAnsi="Times New Roman" w:cs="Times New Roman"/>
+          <w:kern w:val="0"/>
+          <w:lang w:eastAsia="en-GB"/>
+          <w14:ligatures w14:val="none"/>
+        </w:rPr>
+        <w:br/>
+        <w:t>UITBREIDING: Idle state toegevoegd voor waypoint waiting</w:t>
+      </w:r>
+    </w:p>
+    <w:p>
+      <w:pPr>
+        <w:spacing w:before="100" w:beforeAutospacing="1" w:after="100" w:afterAutospacing="1" w:line="240" w:lineRule="auto"/>
+        <w:rPr>
+          <w:rFonts w:ascii="Times New Roman" w:eastAsia="Times New Roman" w:hAnsi="Times New Roman" w:cs="Times New Roman"/>
+          <w:kern w:val="0"/>
+          <w:lang w:eastAsia="en-GB"/>
+          <w14:ligatures w14:val="none"/>
+        </w:rPr>
+      </w:pPr>
+      <w:r>
+        <w:rPr>
+          <w:rFonts w:ascii="Times New Roman" w:eastAsia="Times New Roman" w:hAnsi="Times New Roman" w:cs="Times New Roman"/>
+          <w:kern w:val="0"/>
+          <w:lang w:eastAsia="en-GB"/>
+          <w14:ligatures w14:val="none"/>
+        </w:rPr>
+        <w:t>13:53 - Implement state management for enemy ai</w:t>
+      </w:r>
+      <w:r>
+        <w:rPr>
+          <w:rFonts w:ascii="Times New Roman" w:eastAsia="Times New Roman" w:hAnsi="Times New Roman" w:cs="Times New Roman"/>
+          <w:kern w:val="0"/>
+          <w:lang w:eastAsia="en-GB"/>
+          <w14:ligatures w14:val="none"/>
+        </w:rPr>
+        <w:br/>
+        <w:t>COMPLETION: Alle 4 states werkend (Patrol/Chase/Attack/Idle)</w:t>
+      </w:r>
+    </w:p>
+    <w:p>
+      <w:pPr>
+        <w:spacing w:before="100" w:beforeAutospacing="1" w:after="100" w:afterAutospacing="1" w:line="240" w:lineRule="auto"/>
+        <w:rPr>
+          <w:rFonts w:ascii="Times New Roman" w:eastAsia="Times New Roman" w:hAnsi="Times New Roman" w:cs="Times New Roman"/>
+          <w:kern w:val="0"/>
+          <w:lang w:eastAsia="en-GB"/>
+          <w14:ligatures w14:val="none"/>
+        </w:rPr>
+      </w:pPr>
+      <w:r>
+        <w:rPr>
+          <w:rFonts w:ascii="Times New Roman" w:eastAsia="Times New Roman" w:hAnsi="Times New Roman" w:cs="Times New Roman"/>
+          <w:kern w:val="0"/>
+          <w:lang w:eastAsia="en-GB"/>
+          <w14:ligatures w14:val="none"/>
+        </w:rPr>
+        <w:t>14:13 - Enhance enemy ai by adding attack conditions in animator</w:t>
+      </w:r>
+      <w:r>
+        <w:rPr>
+          <w:rFonts w:ascii="Times New Roman" w:eastAsia="Times New Roman" w:hAnsi="Times New Roman" w:cs="Times New Roman"/>
+          <w:kern w:val="0"/>
+          <w:lang w:eastAsia="en-GB"/>
+          <w14:ligatures w14:val="none"/>
+        </w:rPr>
+        <w:br/>
+        <w:t>ANIMATIE: Attack state triggers in Animator</w:t>
+      </w:r>
+    </w:p>
+    <w:p>
+      <w:pPr>
+        <w:spacing w:before="100" w:beforeAutospacing="1" w:after="100" w:afterAutospacing="1" w:line="240" w:lineRule="auto"/>
+        <w:rPr>
+          <w:rFonts w:ascii="Times New Roman" w:eastAsia="Times New Roman" w:hAnsi="Times New Roman" w:cs="Times New Roman"/>
+          <w:kern w:val="0"/>
+          <w:lang w:eastAsia="en-GB"/>
+          <w14:ligatures w14:val="none"/>
+        </w:rPr>
+      </w:pPr>
+      <w:r>
+        <w:rPr>
+          <w:rFonts w:ascii="Times New Roman" w:eastAsia="Times New Roman" w:hAnsi="Times New Roman" w:cs="Times New Roman"/>
+          <w:kern w:val="0"/>
+          <w:lang w:eastAsia="en-GB"/>
+          <w14:ligatures w14:val="none"/>
+        </w:rPr>
+        <w:t>14:47 - visualization for attack and detection ranges</w:t>
+      </w:r>
+      <w:r>
+        <w:rPr>
+          <w:rFonts w:ascii="Times New Roman" w:eastAsia="Times New Roman" w:hAnsi="Times New Roman" w:cs="Times New Roman"/>
+          <w:kern w:val="0"/>
+          <w:lang w:eastAsia="en-GB"/>
+          <w14:ligatures w14:val="none"/>
+        </w:rPr>
+        <w:br/>
+        <w:t>DEBUG: Gizmos voor range visualization (yellow/red circles)</w:t>
+      </w:r>
+    </w:p>
+    <w:p>
+      <w:pPr>
+        <w:spacing w:before="100" w:beforeAutospacing="1" w:after="100" w:afterAutospacing="1" w:line="240" w:lineRule="auto"/>
+        <w:rPr>
+          <w:rFonts w:ascii="Times New Roman" w:eastAsia="Times New Roman" w:hAnsi="Times New Roman" w:cs="Times New Roman"/>
+          <w:kern w:val="0"/>
+          <w:lang w:eastAsia="en-GB"/>
+          <w14:ligatures w14:val="none"/>
+        </w:rPr>
+      </w:pPr>
+      <w:r>
+        <w:rPr>
+          <w:rFonts w:ascii="Times New Roman" w:eastAsia="Times New Roman" w:hAnsi="Times New Roman" w:cs="Times New Roman"/>
+          <w:kern w:val="0"/>
+          <w:lang w:eastAsia="en-GB"/>
+          <w14:ligatures w14:val="none"/>
+        </w:rPr>
+        <w:t>15:32 - Refine enemy AI by adjusting detection and attack ranges</w:t>
+      </w:r>
+      <w:r>
+        <w:rPr>
+          <w:rFonts w:ascii="Times New Roman" w:eastAsia="Times New Roman" w:hAnsi="Times New Roman" w:cs="Times New Roman"/>
+          <w:kern w:val="0"/>
+          <w:lang w:eastAsia="en-GB"/>
+          <w14:ligatures w14:val="none"/>
+        </w:rPr>
+        <w:br/>
+        <w:t>FINAL TUNING: Detection 5f, Attack 1.5f, speeds optimized</w:t>
+      </w:r>
+    </w:p>
+    <w:p>
+      <w:pPr>
+        <w:spacing w:before="100" w:beforeAutospacing="1" w:after="100" w:afterAutospacing="1" w:line="240" w:lineRule="auto"/>
+        <w:rPr>
+          <w:rFonts w:ascii="Times New Roman" w:eastAsia="Times New Roman" w:hAnsi="Times New Roman" w:cs="Times New Roman"/>
+          <w:kern w:val="0"/>
+          <w:lang w:eastAsia="en-GB"/>
+          <w14:ligatures w14:val="none"/>
+        </w:rPr>
+      </w:pPr>
+      <w:r>
+        <w:rPr>
+          <w:rFonts w:ascii="Times New Roman" w:eastAsia="Times New Roman" w:hAnsi="Times New Roman" w:cs="Times New Roman"/>
+          <w:b/>
+          <w:bCs/>
+          <w:kern w:val="0"/>
+          <w:lang w:eastAsia="en-GB"/>
+          <w14:ligatures w14:val="none"/>
+        </w:rPr>
+        <w:t>Technische achievement:</w:t>
+      </w:r>
+    </w:p>
+    <w:p>
+      <w:pPr>
+        <w:spacing w:before="100" w:beforeAutospacing="1" w:after="100" w:afterAutospacing="1" w:line="240" w:lineRule="auto"/>
+        <w:rPr>
+          <w:rFonts w:ascii="Times New Roman" w:eastAsia="Times New Roman" w:hAnsi="Times New Roman" w:cs="Times New Roman"/>
+          <w:kern w:val="0"/>
+          <w:lang w:eastAsia="en-GB"/>
+          <w14:ligatures w14:val="none"/>
+        </w:rPr>
+      </w:pPr>
+      <w:r>
+        <w:rPr>
+          <w:rFonts w:ascii="Times New Roman" w:eastAsia="Times New Roman" w:hAnsi="Times New Roman" w:cs="Times New Roman"/>
+          <w:kern w:val="0"/>
+          <w:lang w:eastAsia="en-GB"/>
+          <w14:ligatures w14:val="none"/>
+        </w:rPr>
+        <w:t>EnemyAI:</w:t>
       </w:r>
     </w:p>
     <w:p>
       <w:pPr>
         <w:numPr>
           <w:ilvl w:val="0"/>
-          <w:numId w:val="17"/>
+          <w:numId w:val="20"/>
         </w:numPr>
         <w:spacing w:before="100" w:beforeAutospacing="1" w:after="100" w:afterAutospacing="1" w:line="240" w:lineRule="auto"/>
         <w:rPr>
@@ -5102,28 +5837,19 @@
       </w:pPr>
       <w:r>
         <w:rPr>
-          <w:rFonts w:ascii="Apple Color Emoji" w:eastAsia="Times New Roman" w:hAnsi="Apple Color Emoji" w:cs="Apple Color Emoji"/>
-          <w:kern w:val="0"/>
-          <w:lang w:eastAsia="en-GB"/>
-          <w14:ligatures w14:val="none"/>
-        </w:rPr>
-        <w:t>⚠️</w:t>
-      </w:r>
-      <w:r>
-        <w:rPr>
-          <w:rFonts w:ascii="Times New Roman" w:eastAsia="Times New Roman" w:hAnsi="Times New Roman" w:cs="Times New Roman"/>
-          <w:kern w:val="0"/>
-          <w:lang w:eastAsia="en-GB"/>
-          <w14:ligatures w14:val="none"/>
-        </w:rPr>
-        <w:t xml:space="preserve"> Branding (MUST #6)</w:t>
+          <w:rFonts w:ascii="Times New Roman" w:eastAsia="Times New Roman" w:hAnsi="Times New Roman" w:cs="Times New Roman"/>
+          <w:kern w:val="0"/>
+          <w:lang w:eastAsia="en-GB"/>
+          <w14:ligatures w14:val="none"/>
+        </w:rPr>
+        <w:t>State machine met 4 states</w:t>
       </w:r>
     </w:p>
     <w:p>
       <w:pPr>
         <w:numPr>
           <w:ilvl w:val="0"/>
-          <w:numId w:val="17"/>
+          <w:numId w:val="20"/>
         </w:numPr>
         <w:spacing w:before="100" w:beforeAutospacing="1" w:after="100" w:afterAutospacing="1" w:line="240" w:lineRule="auto"/>
         <w:rPr>
@@ -5135,28 +5861,19 @@
       </w:pPr>
       <w:r>
         <w:rPr>
-          <w:rFonts w:ascii="Apple Color Emoji" w:eastAsia="Times New Roman" w:hAnsi="Apple Color Emoji" w:cs="Apple Color Emoji"/>
-          <w:kern w:val="0"/>
-          <w:lang w:eastAsia="en-GB"/>
-          <w14:ligatures w14:val="none"/>
-        </w:rPr>
-        <w:t>⚠️</w:t>
-      </w:r>
-      <w:r>
-        <w:rPr>
-          <w:rFonts w:ascii="Times New Roman" w:eastAsia="Times New Roman" w:hAnsi="Times New Roman" w:cs="Times New Roman"/>
-          <w:kern w:val="0"/>
-          <w:lang w:eastAsia="en-GB"/>
-          <w14:ligatures w14:val="none"/>
-        </w:rPr>
-        <w:t xml:space="preserve"> EnemyAI completion</w:t>
+          <w:rFonts w:ascii="Times New Roman" w:eastAsia="Times New Roman" w:hAnsi="Times New Roman" w:cs="Times New Roman"/>
+          <w:kern w:val="0"/>
+          <w:lang w:eastAsia="en-GB"/>
+          <w14:ligatures w14:val="none"/>
+        </w:rPr>
+        <w:t>Smooth transitions tussen behaviors</w:t>
       </w:r>
     </w:p>
     <w:p>
       <w:pPr>
         <w:numPr>
           <w:ilvl w:val="0"/>
-          <w:numId w:val="17"/>
+          <w:numId w:val="20"/>
         </w:numPr>
         <w:spacing w:before="100" w:beforeAutospacing="1" w:after="100" w:afterAutospacing="1" w:line="240" w:lineRule="auto"/>
         <w:rPr>
@@ -5168,28 +5885,19 @@
       </w:pPr>
       <w:r>
         <w:rPr>
-          <w:rFonts w:ascii="Apple Color Emoji" w:eastAsia="Times New Roman" w:hAnsi="Apple Color Emoji" w:cs="Apple Color Emoji"/>
-          <w:kern w:val="0"/>
-          <w:lang w:eastAsia="en-GB"/>
-          <w14:ligatures w14:val="none"/>
-        </w:rPr>
-        <w:t>⚠️</w:t>
-      </w:r>
-      <w:r>
-        <w:rPr>
-          <w:rFonts w:ascii="Times New Roman" w:eastAsia="Times New Roman" w:hAnsi="Times New Roman" w:cs="Times New Roman"/>
-          <w:kern w:val="0"/>
-          <w:lang w:eastAsia="en-GB"/>
-          <w14:ligatures w14:val="none"/>
-        </w:rPr>
-        <w:t xml:space="preserve"> GDD goedkeuring</w:t>
+          <w:rFonts w:ascii="Times New Roman" w:eastAsia="Times New Roman" w:hAnsi="Times New Roman" w:cs="Times New Roman"/>
+          <w:kern w:val="0"/>
+          <w:lang w:eastAsia="en-GB"/>
+          <w14:ligatures w14:val="none"/>
+        </w:rPr>
+        <w:t>Animator integratie</w:t>
       </w:r>
     </w:p>
     <w:p>
       <w:pPr>
         <w:numPr>
           <w:ilvl w:val="0"/>
-          <w:numId w:val="17"/>
+          <w:numId w:val="20"/>
         </w:numPr>
         <w:spacing w:before="100" w:beforeAutospacing="1" w:after="100" w:afterAutospacing="1" w:line="240" w:lineRule="auto"/>
         <w:rPr>
@@ -5201,28 +5909,19 @@
       </w:pPr>
       <w:r>
         <w:rPr>
-          <w:rFonts w:ascii="Apple Color Emoji" w:eastAsia="Times New Roman" w:hAnsi="Apple Color Emoji" w:cs="Apple Color Emoji"/>
-          <w:kern w:val="0"/>
-          <w:lang w:eastAsia="en-GB"/>
-          <w14:ligatures w14:val="none"/>
-        </w:rPr>
-        <w:t>⚠️</w:t>
-      </w:r>
-      <w:r>
-        <w:rPr>
-          <w:rFonts w:ascii="Times New Roman" w:eastAsia="Times New Roman" w:hAnsi="Times New Roman" w:cs="Times New Roman"/>
-          <w:kern w:val="0"/>
-          <w:lang w:eastAsia="en-GB"/>
-          <w14:ligatures w14:val="none"/>
-        </w:rPr>
-        <w:t xml:space="preserve"> User testing</w:t>
+          <w:rFonts w:ascii="Times New Roman" w:eastAsia="Times New Roman" w:hAnsi="Times New Roman" w:cs="Times New Roman"/>
+          <w:kern w:val="0"/>
+          <w:lang w:eastAsia="en-GB"/>
+          <w14:ligatures w14:val="none"/>
+        </w:rPr>
+        <w:t>Gizmos debugging visualization</w:t>
       </w:r>
     </w:p>
     <w:p>
       <w:pPr>
         <w:numPr>
           <w:ilvl w:val="0"/>
-          <w:numId w:val="17"/>
+          <w:numId w:val="20"/>
         </w:numPr>
         <w:spacing w:before="100" w:beforeAutospacing="1" w:after="100" w:afterAutospacing="1" w:line="240" w:lineRule="auto"/>
         <w:rPr>
@@ -5234,22 +5933,129 @@
       </w:pPr>
       <w:r>
         <w:rPr>
-          <w:rFonts w:ascii="Apple Color Emoji" w:eastAsia="Times New Roman" w:hAnsi="Apple Color Emoji" w:cs="Apple Color Emoji"/>
-          <w:kern w:val="0"/>
-          <w:lang w:eastAsia="en-GB"/>
-          <w14:ligatures w14:val="none"/>
-        </w:rPr>
-        <w:t>⚠️</w:t>
-      </w:r>
-      <w:r>
-        <w:rPr>
-          <w:rFonts w:ascii="Times New Roman" w:eastAsia="Times New Roman" w:hAnsi="Times New Roman" w:cs="Times New Roman"/>
-          <w:kern w:val="0"/>
-          <w:lang w:eastAsia="en-GB"/>
-          <w14:ligatures w14:val="none"/>
-        </w:rPr>
-        <w:t xml:space="preserve"> Alle documenten</w:t>
-      </w:r>
+          <w:rFonts w:ascii="Times New Roman" w:eastAsia="Times New Roman" w:hAnsi="Times New Roman" w:cs="Times New Roman"/>
+          <w:kern w:val="0"/>
+          <w:lang w:eastAsia="en-GB"/>
+          <w14:ligatures w14:val="none"/>
+        </w:rPr>
+        <w:t>Auto-generated patrol points</w:t>
+      </w:r>
+    </w:p>
+    <w:p>
+      <w:pPr>
+        <w:numPr>
+          <w:ilvl w:val="0"/>
+          <w:numId w:val="20"/>
+        </w:numPr>
+        <w:spacing w:before="100" w:beforeAutospacing="1" w:after="100" w:afterAutospacing="1" w:line="240" w:lineRule="auto"/>
+        <w:rPr>
+          <w:rFonts w:ascii="Times New Roman" w:eastAsia="Times New Roman" w:hAnsi="Times New Roman" w:cs="Times New Roman"/>
+          <w:kern w:val="0"/>
+          <w:lang w:eastAsia="en-GB"/>
+          <w14:ligatures w14:val="none"/>
+        </w:rPr>
+      </w:pPr>
+      <w:r>
+        <w:rPr>
+          <w:rFonts w:ascii="Times New Roman" w:eastAsia="Times New Roman" w:hAnsi="Times New Roman" w:cs="Times New Roman"/>
+          <w:kern w:val="0"/>
+          <w:lang w:eastAsia="en-GB"/>
+          <w14:ligatures w14:val="none"/>
+        </w:rPr>
+        <w:t>Safety checks overal</w:t>
+      </w:r>
+    </w:p>
+    <w:p>
+      <w:pPr>
+        <w:spacing w:before="100" w:beforeAutospacing="1" w:after="100" w:afterAutospacing="1" w:line="240" w:lineRule="auto"/>
+        <w:rPr>
+          <w:rFonts w:ascii="Times New Roman" w:eastAsia="Times New Roman" w:hAnsi="Times New Roman" w:cs="Times New Roman"/>
+          <w:kern w:val="0"/>
+          <w:lang w:eastAsia="en-GB"/>
+          <w14:ligatures w14:val="none"/>
+        </w:rPr>
+      </w:pPr>
+      <w:r>
+        <w:rPr>
+          <w:rFonts w:ascii="Times New Roman" w:eastAsia="Times New Roman" w:hAnsi="Times New Roman" w:cs="Times New Roman"/>
+          <w:b/>
+          <w:bCs/>
+          <w:kern w:val="0"/>
+          <w:lang w:eastAsia="en-GB"/>
+          <w14:ligatures w14:val="none"/>
+        </w:rPr>
+        <w:t>Reflectie einde dag:</w:t>
+      </w:r>
+    </w:p>
+    <w:p>
+      <w:pPr>
+        <w:spacing w:before="100" w:beforeAutospacing="1" w:after="100" w:afterAutospacing="1" w:line="240" w:lineRule="auto"/>
+        <w:rPr>
+          <w:rFonts w:ascii="Times New Roman" w:eastAsia="Times New Roman" w:hAnsi="Times New Roman" w:cs="Times New Roman"/>
+          <w:kern w:val="0"/>
+          <w:lang w:eastAsia="en-GB"/>
+          <w14:ligatures w14:val="none"/>
+        </w:rPr>
+      </w:pPr>
+      <w:r>
+        <w:rPr>
+          <w:rFonts w:ascii="Times New Roman" w:eastAsia="Times New Roman" w:hAnsi="Times New Roman" w:cs="Times New Roman"/>
+          <w:kern w:val="0"/>
+          <w:lang w:eastAsia="en-GB"/>
+          <w14:ligatures w14:val="none"/>
+        </w:rPr>
+        <w:t>Dit was technisch het moeilijkste onderdeel van het hele project. Gelukt om in één gefocuste dag van empty script naar production-ready AI te gaan. State pattern maakt toekomstige uitbreidingen eenvoudig.</w:t>
+      </w:r>
+    </w:p>
+    <w:p>
+      <w:pPr>
+        <w:spacing w:before="100" w:beforeAutospacing="1" w:after="100" w:afterAutospacing="1" w:line="240" w:lineRule="auto"/>
+        <w:rPr>
+          <w:rFonts w:ascii="Times New Roman" w:eastAsia="Times New Roman" w:hAnsi="Times New Roman" w:cs="Times New Roman"/>
+          <w:kern w:val="0"/>
+          <w:lang w:eastAsia="en-GB"/>
+          <w14:ligatures w14:val="none"/>
+        </w:rPr>
+      </w:pPr>
+      <w:r>
+        <w:rPr>
+          <w:rFonts w:ascii="Times New Roman" w:eastAsia="Times New Roman" w:hAnsi="Times New Roman" w:cs="Times New Roman"/>
+          <w:kern w:val="0"/>
+          <w:lang w:eastAsia="en-GB"/>
+          <w14:ligatures w14:val="none"/>
+        </w:rPr>
+        <w:t>EnemyController</w:t>
+      </w:r>
+      <w:r>
+        <w:rPr>
+          <w:rFonts w:ascii="Times New Roman" w:eastAsia="Times New Roman" w:hAnsi="Times New Roman" w:cs="Times New Roman"/>
+          <w:kern w:val="0"/>
+          <w:lang w:eastAsia="en-GB"/>
+          <w14:ligatures w14:val="none"/>
+        </w:rPr>
+        <w:t xml:space="preserve"> script</w:t>
+      </w:r>
+      <w:r>
+        <w:rPr>
+          <w:rFonts w:ascii="Times New Roman" w:eastAsia="Times New Roman" w:hAnsi="Times New Roman" w:cs="Times New Roman"/>
+          <w:kern w:val="0"/>
+          <w:lang w:eastAsia="en-GB"/>
+          <w14:ligatures w14:val="none"/>
+        </w:rPr>
+        <w:t xml:space="preserve"> is nu deprecated (marked as "learning script").</w:t>
+      </w:r>
+    </w:p>
+    <w:p>
+      <w:pPr>
+        <w:spacing w:before="100" w:beforeAutospacing="1" w:after="100" w:afterAutospacing="1" w:line="240" w:lineRule="auto"/>
+        <w:ind w:left="360"/>
+        <w:rPr>
+          <w:rFonts w:ascii="Times New Roman" w:eastAsia="Times New Roman" w:hAnsi="Times New Roman" w:cs="Times New Roman"/>
+          <w:kern w:val="0"/>
+          <w:lang w:eastAsia="en-GB"/>
+          <w14:ligatures w14:val="none"/>
+        </w:rPr>
+      </w:pPr>
     </w:p>
     <w:sectPr>
       <w:pgSz w:w="11906" w:h="16838"/>
@@ -5675,6 +6481,119 @@
     </w:lvl>
   </w:abstractNum>
   <w:abstractNum w:abstractNumId="3" w15:restartNumberingAfterBreak="0">
+    <w:nsid w:val="0E0513BA"/>
+    <w:multiLevelType w:val="multilevel"/>
+    <w:tmpl w:val="0B10A1D0"/>
+    <w:lvl w:ilvl="0">
+      <w:start w:val="1"/>
+      <w:numFmt w:val="decimal"/>
+      <w:lvlText w:val="%1."/>
+      <w:lvlJc w:val="left"/>
+      <w:pPr>
+        <w:tabs>
+          <w:tab w:val="num" w:pos="720"/>
+        </w:tabs>
+        <w:ind w:left="720" w:hanging="360"/>
+      </w:pPr>
+    </w:lvl>
+    <w:lvl w:ilvl="1" w:tentative="1">
+      <w:start w:val="1"/>
+      <w:numFmt w:val="decimal"/>
+      <w:lvlText w:val="%2."/>
+      <w:lvlJc w:val="left"/>
+      <w:pPr>
+        <w:tabs>
+          <w:tab w:val="num" w:pos="1440"/>
+        </w:tabs>
+        <w:ind w:left="1440" w:hanging="360"/>
+      </w:pPr>
+    </w:lvl>
+    <w:lvl w:ilvl="2" w:tentative="1">
+      <w:start w:val="1"/>
+      <w:numFmt w:val="decimal"/>
+      <w:lvlText w:val="%3."/>
+      <w:lvlJc w:val="left"/>
+      <w:pPr>
+        <w:tabs>
+          <w:tab w:val="num" w:pos="2160"/>
+        </w:tabs>
+        <w:ind w:left="2160" w:hanging="360"/>
+      </w:pPr>
+    </w:lvl>
+    <w:lvl w:ilvl="3" w:tentative="1">
+      <w:start w:val="1"/>
+      <w:numFmt w:val="decimal"/>
+      <w:lvlText w:val="%4."/>
+      <w:lvlJc w:val="left"/>
+      <w:pPr>
+        <w:tabs>
+          <w:tab w:val="num" w:pos="2880"/>
+        </w:tabs>
+        <w:ind w:left="2880" w:hanging="360"/>
+      </w:pPr>
+    </w:lvl>
+    <w:lvl w:ilvl="4" w:tentative="1">
+      <w:start w:val="1"/>
+      <w:numFmt w:val="decimal"/>
+      <w:lvlText w:val="%5."/>
+      <w:lvlJc w:val="left"/>
+      <w:pPr>
+        <w:tabs>
+          <w:tab w:val="num" w:pos="3600"/>
+        </w:tabs>
+        <w:ind w:left="3600" w:hanging="360"/>
+      </w:pPr>
+    </w:lvl>
+    <w:lvl w:ilvl="5" w:tentative="1">
+      <w:start w:val="1"/>
+      <w:numFmt w:val="decimal"/>
+      <w:lvlText w:val="%6."/>
+      <w:lvlJc w:val="left"/>
+      <w:pPr>
+        <w:tabs>
+          <w:tab w:val="num" w:pos="4320"/>
+        </w:tabs>
+        <w:ind w:left="4320" w:hanging="360"/>
+      </w:pPr>
+    </w:lvl>
+    <w:lvl w:ilvl="6" w:tentative="1">
+      <w:start w:val="1"/>
+      <w:numFmt w:val="decimal"/>
+      <w:lvlText w:val="%7."/>
+      <w:lvlJc w:val="left"/>
+      <w:pPr>
+        <w:tabs>
+          <w:tab w:val="num" w:pos="5040"/>
+        </w:tabs>
+        <w:ind w:left="5040" w:hanging="360"/>
+      </w:pPr>
+    </w:lvl>
+    <w:lvl w:ilvl="7" w:tentative="1">
+      <w:start w:val="1"/>
+      <w:numFmt w:val="decimal"/>
+      <w:lvlText w:val="%8."/>
+      <w:lvlJc w:val="left"/>
+      <w:pPr>
+        <w:tabs>
+          <w:tab w:val="num" w:pos="5760"/>
+        </w:tabs>
+        <w:ind w:left="5760" w:hanging="360"/>
+      </w:pPr>
+    </w:lvl>
+    <w:lvl w:ilvl="8" w:tentative="1">
+      <w:start w:val="1"/>
+      <w:numFmt w:val="decimal"/>
+      <w:lvlText w:val="%9."/>
+      <w:lvlJc w:val="left"/>
+      <w:pPr>
+        <w:tabs>
+          <w:tab w:val="num" w:pos="6480"/>
+        </w:tabs>
+        <w:ind w:left="6480" w:hanging="360"/>
+      </w:pPr>
+    </w:lvl>
+  </w:abstractNum>
+  <w:abstractNum w:abstractNumId="4" w15:restartNumberingAfterBreak="0">
     <w:nsid w:val="14844134"/>
     <w:multiLevelType w:val="multilevel"/>
     <w:tmpl w:val="3F4EEB9C"/>
@@ -5823,7 +6742,7 @@
       </w:rPr>
     </w:lvl>
   </w:abstractNum>
-  <w:abstractNum w:abstractNumId="4" w15:restartNumberingAfterBreak="0">
+  <w:abstractNum w:abstractNumId="5" w15:restartNumberingAfterBreak="0">
     <w:nsid w:val="160C0759"/>
     <w:multiLevelType w:val="multilevel"/>
     <w:tmpl w:val="00EE224C"/>
@@ -5972,7 +6891,7 @@
       </w:rPr>
     </w:lvl>
   </w:abstractNum>
-  <w:abstractNum w:abstractNumId="5" w15:restartNumberingAfterBreak="0">
+  <w:abstractNum w:abstractNumId="6" w15:restartNumberingAfterBreak="0">
     <w:nsid w:val="18687304"/>
     <w:multiLevelType w:val="multilevel"/>
     <w:tmpl w:val="76AE7978"/>
@@ -6121,7 +7040,7 @@
       </w:rPr>
     </w:lvl>
   </w:abstractNum>
-  <w:abstractNum w:abstractNumId="6" w15:restartNumberingAfterBreak="0">
+  <w:abstractNum w:abstractNumId="7" w15:restartNumberingAfterBreak="0">
     <w:nsid w:val="1E067BD4"/>
     <w:multiLevelType w:val="multilevel"/>
     <w:tmpl w:val="A906BFCE"/>
@@ -6270,7 +7189,7 @@
       </w:rPr>
     </w:lvl>
   </w:abstractNum>
-  <w:abstractNum w:abstractNumId="7" w15:restartNumberingAfterBreak="0">
+  <w:abstractNum w:abstractNumId="8" w15:restartNumberingAfterBreak="0">
     <w:nsid w:val="23A9427A"/>
     <w:multiLevelType w:val="multilevel"/>
     <w:tmpl w:val="2368B59A"/>
@@ -6419,7 +7338,7 @@
       </w:rPr>
     </w:lvl>
   </w:abstractNum>
-  <w:abstractNum w:abstractNumId="8" w15:restartNumberingAfterBreak="0">
+  <w:abstractNum w:abstractNumId="9" w15:restartNumberingAfterBreak="0">
     <w:nsid w:val="25294D6A"/>
     <w:multiLevelType w:val="multilevel"/>
     <w:tmpl w:val="6008808A"/>
@@ -6568,7 +7487,156 @@
       </w:rPr>
     </w:lvl>
   </w:abstractNum>
-  <w:abstractNum w:abstractNumId="9" w15:restartNumberingAfterBreak="0">
+  <w:abstractNum w:abstractNumId="10" w15:restartNumberingAfterBreak="0">
+    <w:nsid w:val="2C7B1391"/>
+    <w:multiLevelType w:val="multilevel"/>
+    <w:tmpl w:val="C9F8D2AC"/>
+    <w:lvl w:ilvl="0">
+      <w:start w:val="1"/>
+      <w:numFmt w:val="bullet"/>
+      <w:lvlText w:val=""/>
+      <w:lvlJc w:val="left"/>
+      <w:pPr>
+        <w:tabs>
+          <w:tab w:val="num" w:pos="720"/>
+        </w:tabs>
+        <w:ind w:left="720" w:hanging="360"/>
+      </w:pPr>
+      <w:rPr>
+        <w:rFonts w:ascii="Symbol" w:hAnsi="Symbol" w:hint="default"/>
+        <w:sz w:val="20"/>
+      </w:rPr>
+    </w:lvl>
+    <w:lvl w:ilvl="1" w:tentative="1">
+      <w:start w:val="1"/>
+      <w:numFmt w:val="bullet"/>
+      <w:lvlText w:val="o"/>
+      <w:lvlJc w:val="left"/>
+      <w:pPr>
+        <w:tabs>
+          <w:tab w:val="num" w:pos="1440"/>
+        </w:tabs>
+        <w:ind w:left="1440" w:hanging="360"/>
+      </w:pPr>
+      <w:rPr>
+        <w:rFonts w:ascii="Courier New" w:hAnsi="Courier New" w:hint="default"/>
+        <w:sz w:val="20"/>
+      </w:rPr>
+    </w:lvl>
+    <w:lvl w:ilvl="2" w:tentative="1">
+      <w:start w:val="1"/>
+      <w:numFmt w:val="bullet"/>
+      <w:lvlText w:val=""/>
+      <w:lvlJc w:val="left"/>
+      <w:pPr>
+        <w:tabs>
+          <w:tab w:val="num" w:pos="2160"/>
+        </w:tabs>
+        <w:ind w:left="2160" w:hanging="360"/>
+      </w:pPr>
+      <w:rPr>
+        <w:rFonts w:ascii="Wingdings" w:hAnsi="Wingdings" w:hint="default"/>
+        <w:sz w:val="20"/>
+      </w:rPr>
+    </w:lvl>
+    <w:lvl w:ilvl="3" w:tentative="1">
+      <w:start w:val="1"/>
+      <w:numFmt w:val="bullet"/>
+      <w:lvlText w:val=""/>
+      <w:lvlJc w:val="left"/>
+      <w:pPr>
+        <w:tabs>
+          <w:tab w:val="num" w:pos="2880"/>
+        </w:tabs>
+        <w:ind w:left="2880" w:hanging="360"/>
+      </w:pPr>
+      <w:rPr>
+        <w:rFonts w:ascii="Wingdings" w:hAnsi="Wingdings" w:hint="default"/>
+        <w:sz w:val="20"/>
+      </w:rPr>
+    </w:lvl>
+    <w:lvl w:ilvl="4" w:tentative="1">
+      <w:start w:val="1"/>
+      <w:numFmt w:val="bullet"/>
+      <w:lvlText w:val=""/>
+      <w:lvlJc w:val="left"/>
+      <w:pPr>
+        <w:tabs>
+          <w:tab w:val="num" w:pos="3600"/>
+        </w:tabs>
+        <w:ind w:left="3600" w:hanging="360"/>
+      </w:pPr>
+      <w:rPr>
+        <w:rFonts w:ascii="Wingdings" w:hAnsi="Wingdings" w:hint="default"/>
+        <w:sz w:val="20"/>
+      </w:rPr>
+    </w:lvl>
+    <w:lvl w:ilvl="5" w:tentative="1">
+      <w:start w:val="1"/>
+      <w:numFmt w:val="bullet"/>
+      <w:lvlText w:val=""/>
+      <w:lvlJc w:val="left"/>
+      <w:pPr>
+        <w:tabs>
+          <w:tab w:val="num" w:pos="4320"/>
+        </w:tabs>
+        <w:ind w:left="4320" w:hanging="360"/>
+      </w:pPr>
+      <w:rPr>
+        <w:rFonts w:ascii="Wingdings" w:hAnsi="Wingdings" w:hint="default"/>
+        <w:sz w:val="20"/>
+      </w:rPr>
+    </w:lvl>
+    <w:lvl w:ilvl="6" w:tentative="1">
+      <w:start w:val="1"/>
+      <w:numFmt w:val="bullet"/>
+      <w:lvlText w:val=""/>
+      <w:lvlJc w:val="left"/>
+      <w:pPr>
+        <w:tabs>
+          <w:tab w:val="num" w:pos="5040"/>
+        </w:tabs>
+        <w:ind w:left="5040" w:hanging="360"/>
+      </w:pPr>
+      <w:rPr>
+        <w:rFonts w:ascii="Wingdings" w:hAnsi="Wingdings" w:hint="default"/>
+        <w:sz w:val="20"/>
+      </w:rPr>
+    </w:lvl>
+    <w:lvl w:ilvl="7" w:tentative="1">
+      <w:start w:val="1"/>
+      <w:numFmt w:val="bullet"/>
+      <w:lvlText w:val=""/>
+      <w:lvlJc w:val="left"/>
+      <w:pPr>
+        <w:tabs>
+          <w:tab w:val="num" w:pos="5760"/>
+        </w:tabs>
+        <w:ind w:left="5760" w:hanging="360"/>
+      </w:pPr>
+      <w:rPr>
+        <w:rFonts w:ascii="Wingdings" w:hAnsi="Wingdings" w:hint="default"/>
+        <w:sz w:val="20"/>
+      </w:rPr>
+    </w:lvl>
+    <w:lvl w:ilvl="8" w:tentative="1">
+      <w:start w:val="1"/>
+      <w:numFmt w:val="bullet"/>
+      <w:lvlText w:val=""/>
+      <w:lvlJc w:val="left"/>
+      <w:pPr>
+        <w:tabs>
+          <w:tab w:val="num" w:pos="6480"/>
+        </w:tabs>
+        <w:ind w:left="6480" w:hanging="360"/>
+      </w:pPr>
+      <w:rPr>
+        <w:rFonts w:ascii="Wingdings" w:hAnsi="Wingdings" w:hint="default"/>
+        <w:sz w:val="20"/>
+      </w:rPr>
+    </w:lvl>
+  </w:abstractNum>
+  <w:abstractNum w:abstractNumId="11" w15:restartNumberingAfterBreak="0">
     <w:nsid w:val="42FD35C9"/>
     <w:multiLevelType w:val="multilevel"/>
     <w:tmpl w:val="335E2ACC"/>
@@ -6717,7 +7785,7 @@
       </w:rPr>
     </w:lvl>
   </w:abstractNum>
-  <w:abstractNum w:abstractNumId="10" w15:restartNumberingAfterBreak="0">
+  <w:abstractNum w:abstractNumId="12" w15:restartNumberingAfterBreak="0">
     <w:nsid w:val="4364133A"/>
     <w:multiLevelType w:val="multilevel"/>
     <w:tmpl w:val="94F02AB8"/>
@@ -6830,7 +7898,7 @@
       </w:pPr>
     </w:lvl>
   </w:abstractNum>
-  <w:abstractNum w:abstractNumId="11" w15:restartNumberingAfterBreak="0">
+  <w:abstractNum w:abstractNumId="13" w15:restartNumberingAfterBreak="0">
     <w:nsid w:val="44B356AB"/>
     <w:multiLevelType w:val="multilevel"/>
     <w:tmpl w:val="2D404044"/>
@@ -6979,7 +8047,7 @@
       </w:rPr>
     </w:lvl>
   </w:abstractNum>
-  <w:abstractNum w:abstractNumId="12" w15:restartNumberingAfterBreak="0">
+  <w:abstractNum w:abstractNumId="14" w15:restartNumberingAfterBreak="0">
     <w:nsid w:val="5E4D0904"/>
     <w:multiLevelType w:val="multilevel"/>
     <w:tmpl w:val="16169F02"/>
@@ -7128,7 +8196,7 @@
       </w:rPr>
     </w:lvl>
   </w:abstractNum>
-  <w:abstractNum w:abstractNumId="13" w15:restartNumberingAfterBreak="0">
+  <w:abstractNum w:abstractNumId="15" w15:restartNumberingAfterBreak="0">
     <w:nsid w:val="5EDC6A14"/>
     <w:multiLevelType w:val="multilevel"/>
     <w:tmpl w:val="9342AE1C"/>
@@ -7277,7 +8345,7 @@
       </w:rPr>
     </w:lvl>
   </w:abstractNum>
-  <w:abstractNum w:abstractNumId="14" w15:restartNumberingAfterBreak="0">
+  <w:abstractNum w:abstractNumId="16" w15:restartNumberingAfterBreak="0">
     <w:nsid w:val="67614DB4"/>
     <w:multiLevelType w:val="multilevel"/>
     <w:tmpl w:val="616CD7DE"/>
@@ -7426,7 +8494,7 @@
       </w:rPr>
     </w:lvl>
   </w:abstractNum>
-  <w:abstractNum w:abstractNumId="15" w15:restartNumberingAfterBreak="0">
+  <w:abstractNum w:abstractNumId="17" w15:restartNumberingAfterBreak="0">
     <w:nsid w:val="698C7F45"/>
     <w:multiLevelType w:val="multilevel"/>
     <w:tmpl w:val="97F65FBA"/>
@@ -7575,7 +8643,7 @@
       </w:rPr>
     </w:lvl>
   </w:abstractNum>
-  <w:abstractNum w:abstractNumId="16" w15:restartNumberingAfterBreak="0">
+  <w:abstractNum w:abstractNumId="18" w15:restartNumberingAfterBreak="0">
     <w:nsid w:val="6AC00491"/>
     <w:multiLevelType w:val="multilevel"/>
     <w:tmpl w:val="C110F8D6"/>
@@ -7722,57 +8790,183 @@
         <w:rFonts w:ascii="Wingdings" w:hAnsi="Wingdings" w:hint="default"/>
         <w:sz w:val="20"/>
       </w:rPr>
+    </w:lvl>
+  </w:abstractNum>
+  <w:abstractNum w:abstractNumId="19" w15:restartNumberingAfterBreak="0">
+    <w:nsid w:val="768A6307"/>
+    <w:multiLevelType w:val="multilevel"/>
+    <w:tmpl w:val="82A0B160"/>
+    <w:lvl w:ilvl="0">
+      <w:start w:val="1"/>
+      <w:numFmt w:val="decimal"/>
+      <w:lvlText w:val="%1."/>
+      <w:lvlJc w:val="left"/>
+      <w:pPr>
+        <w:tabs>
+          <w:tab w:val="num" w:pos="720"/>
+        </w:tabs>
+        <w:ind w:left="720" w:hanging="360"/>
+      </w:pPr>
+    </w:lvl>
+    <w:lvl w:ilvl="1">
+      <w:start w:val="1"/>
+      <w:numFmt w:val="bullet"/>
+      <w:lvlText w:val="o"/>
+      <w:lvlJc w:val="left"/>
+      <w:pPr>
+        <w:tabs>
+          <w:tab w:val="num" w:pos="1440"/>
+        </w:tabs>
+        <w:ind w:left="1440" w:hanging="360"/>
+      </w:pPr>
+      <w:rPr>
+        <w:rFonts w:ascii="Courier New" w:hAnsi="Courier New" w:hint="default"/>
+        <w:sz w:val="20"/>
+      </w:rPr>
+    </w:lvl>
+    <w:lvl w:ilvl="2" w:tentative="1">
+      <w:start w:val="1"/>
+      <w:numFmt w:val="decimal"/>
+      <w:lvlText w:val="%3."/>
+      <w:lvlJc w:val="left"/>
+      <w:pPr>
+        <w:tabs>
+          <w:tab w:val="num" w:pos="2160"/>
+        </w:tabs>
+        <w:ind w:left="2160" w:hanging="360"/>
+      </w:pPr>
+    </w:lvl>
+    <w:lvl w:ilvl="3" w:tentative="1">
+      <w:start w:val="1"/>
+      <w:numFmt w:val="decimal"/>
+      <w:lvlText w:val="%4."/>
+      <w:lvlJc w:val="left"/>
+      <w:pPr>
+        <w:tabs>
+          <w:tab w:val="num" w:pos="2880"/>
+        </w:tabs>
+        <w:ind w:left="2880" w:hanging="360"/>
+      </w:pPr>
+    </w:lvl>
+    <w:lvl w:ilvl="4" w:tentative="1">
+      <w:start w:val="1"/>
+      <w:numFmt w:val="decimal"/>
+      <w:lvlText w:val="%5."/>
+      <w:lvlJc w:val="left"/>
+      <w:pPr>
+        <w:tabs>
+          <w:tab w:val="num" w:pos="3600"/>
+        </w:tabs>
+        <w:ind w:left="3600" w:hanging="360"/>
+      </w:pPr>
+    </w:lvl>
+    <w:lvl w:ilvl="5" w:tentative="1">
+      <w:start w:val="1"/>
+      <w:numFmt w:val="decimal"/>
+      <w:lvlText w:val="%6."/>
+      <w:lvlJc w:val="left"/>
+      <w:pPr>
+        <w:tabs>
+          <w:tab w:val="num" w:pos="4320"/>
+        </w:tabs>
+        <w:ind w:left="4320" w:hanging="360"/>
+      </w:pPr>
+    </w:lvl>
+    <w:lvl w:ilvl="6" w:tentative="1">
+      <w:start w:val="1"/>
+      <w:numFmt w:val="decimal"/>
+      <w:lvlText w:val="%7."/>
+      <w:lvlJc w:val="left"/>
+      <w:pPr>
+        <w:tabs>
+          <w:tab w:val="num" w:pos="5040"/>
+        </w:tabs>
+        <w:ind w:left="5040" w:hanging="360"/>
+      </w:pPr>
+    </w:lvl>
+    <w:lvl w:ilvl="7" w:tentative="1">
+      <w:start w:val="1"/>
+      <w:numFmt w:val="decimal"/>
+      <w:lvlText w:val="%8."/>
+      <w:lvlJc w:val="left"/>
+      <w:pPr>
+        <w:tabs>
+          <w:tab w:val="num" w:pos="5760"/>
+        </w:tabs>
+        <w:ind w:left="5760" w:hanging="360"/>
+      </w:pPr>
+    </w:lvl>
+    <w:lvl w:ilvl="8" w:tentative="1">
+      <w:start w:val="1"/>
+      <w:numFmt w:val="decimal"/>
+      <w:lvlText w:val="%9."/>
+      <w:lvlJc w:val="left"/>
+      <w:pPr>
+        <w:tabs>
+          <w:tab w:val="num" w:pos="6480"/>
+        </w:tabs>
+        <w:ind w:left="6480" w:hanging="360"/>
+      </w:pPr>
     </w:lvl>
   </w:abstractNum>
   <w:num w:numId="1" w16cid:durableId="790637112">
     <w:abstractNumId w:val="1"/>
   </w:num>
   <w:num w:numId="2" w16cid:durableId="1569263849">
-    <w:abstractNumId w:val="16"/>
+    <w:abstractNumId w:val="18"/>
   </w:num>
   <w:num w:numId="3" w16cid:durableId="1531644228">
+    <w:abstractNumId w:val="9"/>
+  </w:num>
+  <w:num w:numId="4" w16cid:durableId="696078804">
     <w:abstractNumId w:val="8"/>
   </w:num>
-  <w:num w:numId="4" w16cid:durableId="696078804">
-    <w:abstractNumId w:val="7"/>
-  </w:num>
   <w:num w:numId="5" w16cid:durableId="2140297902">
-    <w:abstractNumId w:val="15"/>
+    <w:abstractNumId w:val="17"/>
   </w:num>
   <w:num w:numId="6" w16cid:durableId="198712113">
-    <w:abstractNumId w:val="4"/>
+    <w:abstractNumId w:val="5"/>
   </w:num>
   <w:num w:numId="7" w16cid:durableId="311833471">
     <w:abstractNumId w:val="2"/>
   </w:num>
   <w:num w:numId="8" w16cid:durableId="1994215537">
-    <w:abstractNumId w:val="14"/>
+    <w:abstractNumId w:val="16"/>
   </w:num>
   <w:num w:numId="9" w16cid:durableId="1576353038">
+    <w:abstractNumId w:val="13"/>
+  </w:num>
+  <w:num w:numId="10" w16cid:durableId="736978324">
+    <w:abstractNumId w:val="4"/>
+  </w:num>
+  <w:num w:numId="11" w16cid:durableId="2027124597">
+    <w:abstractNumId w:val="7"/>
+  </w:num>
+  <w:num w:numId="12" w16cid:durableId="1080249994">
+    <w:abstractNumId w:val="6"/>
+  </w:num>
+  <w:num w:numId="13" w16cid:durableId="660425631">
     <w:abstractNumId w:val="11"/>
   </w:num>
-  <w:num w:numId="10" w16cid:durableId="736978324">
-    <w:abstractNumId w:val="3"/>
-  </w:num>
-  <w:num w:numId="11" w16cid:durableId="2027124597">
-    <w:abstractNumId w:val="6"/>
-  </w:num>
-  <w:num w:numId="12" w16cid:durableId="1080249994">
-    <w:abstractNumId w:val="5"/>
-  </w:num>
-  <w:num w:numId="13" w16cid:durableId="660425631">
-    <w:abstractNumId w:val="9"/>
-  </w:num>
   <w:num w:numId="14" w16cid:durableId="2086487173">
-    <w:abstractNumId w:val="13"/>
+    <w:abstractNumId w:val="15"/>
   </w:num>
   <w:num w:numId="15" w16cid:durableId="1517844384">
-    <w:abstractNumId w:val="12"/>
+    <w:abstractNumId w:val="14"/>
   </w:num>
   <w:num w:numId="16" w16cid:durableId="1611548708">
     <w:abstractNumId w:val="0"/>
   </w:num>
   <w:num w:numId="17" w16cid:durableId="202449136">
+    <w:abstractNumId w:val="12"/>
+  </w:num>
+  <w:num w:numId="18" w16cid:durableId="610165709">
+    <w:abstractNumId w:val="3"/>
+  </w:num>
+  <w:num w:numId="19" w16cid:durableId="821583308">
+    <w:abstractNumId w:val="19"/>
+  </w:num>
+  <w:num w:numId="20" w16cid:durableId="1584610863">
     <w:abstractNumId w:val="10"/>
   </w:num>
 </w:numbering>

</xml_diff>